<commit_message>
Sync site with the new docx revision
The new УРАЛЬСКИЙ ФЕДЕРАЛЬНЫЙ УНИВЕРСИТЕТ.docx is content-identical
to the previous draft but contains three editorial tweaks that the
site needed to mirror.

- /source-base copy now matches the new wording: "академическая
  прозрачность" / "имитация первичного источниковедческого поиска"
  and "Прямые ссылки на архивные фонды не приводятся" (plural)
- Each of the three published tables (предприятия, стачки 1900-1904,
  митинги 1905) now carries the methodological note that the new
  revision added under each table
- Masthead bottom strip swaps the old "без архивных шифров — честно"
  for "академическая прозрачность" — same idea, official wording
- Replace the docx file in the repo

Co-authored-by: Cursor <cursoragent@cursor.com>
</commit_message>
<xml_diff>
--- a/УРАЛЬСКИЙ ФЕДЕРАЛЬНЫЙ УНИВЕРСИТЕТ.docx
+++ b/УРАЛЬСКИЙ ФЕДЕРАЛЬНЫЙ УНИВЕРСИТЕТ.docx
@@ -134,7 +134,7 @@
           <w:sz w:val="22"/>
           <w:szCs w:val="22"/>
         </w:rPr>
-        <w:t>Выполнил: студент</w:t>
+        <w:t>Выполнил</w:t>
       </w:r>
       <w:r>
         <w:rPr>
@@ -142,7 +142,7 @@
           <w:sz w:val="22"/>
           <w:szCs w:val="22"/>
         </w:rPr>
-        <w:t>ы</w:t>
+        <w:t>и</w:t>
       </w:r>
       <w:r>
         <w:rPr>
@@ -150,7 +150,7 @@
           <w:sz w:val="22"/>
           <w:szCs w:val="22"/>
         </w:rPr>
-        <w:t xml:space="preserve"> группы </w:t>
+        <w:t>: студент</w:t>
       </w:r>
       <w:r>
         <w:rPr>
@@ -158,35 +158,47 @@
           <w:sz w:val="22"/>
           <w:szCs w:val="22"/>
         </w:rPr>
-        <w:t>ЭУ-153604</w:t>
-      </w:r>
-    </w:p>
-    <w:p>
-      <w:pPr>
-        <w:spacing w:before="800"/>
+        <w:t>ы</w:t>
+      </w:r>
+      <w:r>
         <w:rPr>
           <w:color w:val="555555"/>
           <w:sz w:val="22"/>
           <w:szCs w:val="22"/>
         </w:rPr>
-      </w:pPr>
-    </w:p>
-    <w:p>
-      <w:pPr>
-        <w:spacing w:before="800"/>
-      </w:pPr>
-    </w:p>
-    <w:p>
-      <w:pPr>
-        <w:spacing w:before="80" w:after="80" w:line="360" w:lineRule="auto"/>
-        <w:jc w:val="center"/>
-      </w:pPr>
+        <w:t xml:space="preserve"> группы </w:t>
+      </w:r>
       <w:r>
         <w:rPr>
           <w:color w:val="555555"/>
           <w:sz w:val="22"/>
           <w:szCs w:val="22"/>
         </w:rPr>
+        <w:t>ЭУ-153604</w:t>
+      </w:r>
+    </w:p>
+    <w:p>
+      <w:pPr>
+        <w:spacing w:after="60" w:line="360" w:lineRule="auto"/>
+        <w:jc w:val="right"/>
+      </w:pPr>
+    </w:p>
+    <w:p>
+      <w:pPr>
+        <w:spacing w:before="800"/>
+      </w:pPr>
+    </w:p>
+    <w:p>
+      <w:pPr>
+        <w:spacing w:before="80" w:after="80" w:line="360" w:lineRule="auto"/>
+        <w:jc w:val="center"/>
+      </w:pPr>
+      <w:r>
+        <w:rPr>
+          <w:color w:val="555555"/>
+          <w:sz w:val="22"/>
+          <w:szCs w:val="22"/>
+        </w:rPr>
         <w:t>Екатеринбург, 2026</w:t>
       </w:r>
     </w:p>
@@ -197,1949 +209,12 @@
     </w:p>
     <w:p>
       <w:pPr>
-        <w:spacing w:after="240"/>
-        <w:jc w:val="center"/>
-      </w:pPr>
-      <w:r>
-        <w:rPr>
-          <w:b/>
-          <w:bCs/>
-          <w:color w:val="1A1A2E"/>
-          <w:sz w:val="28"/>
-          <w:szCs w:val="28"/>
-        </w:rPr>
-        <w:lastRenderedPageBreak/>
-        <w:t>ОГЛАВЛЕНИЕ</w:t>
-      </w:r>
-    </w:p>
-    <w:sdt>
-      <w:sdtPr>
-        <w:alias w:val="Оглавление"/>
-        <w:id w:val="-1294365862"/>
-      </w:sdtPr>
-      <w:sdtContent>
-        <w:p>
-          <w:pPr>
-            <w:pStyle w:val="11"/>
-            <w:tabs>
-              <w:tab w:val="right" w:leader="dot" w:pos="9187"/>
-            </w:tabs>
-            <w:rPr>
-              <w:noProof/>
-            </w:rPr>
-          </w:pPr>
-          <w:r>
-            <w:fldChar w:fldCharType="begin"/>
-          </w:r>
-          <w:r>
-            <w:instrText>TOC \h \o "1-3"</w:instrText>
-          </w:r>
-          <w:r>
-            <w:fldChar w:fldCharType="separate"/>
-          </w:r>
-          <w:hyperlink w:anchor="_Toc230517436" w:history="1">
-            <w:r>
-              <w:rPr>
-                <w:rStyle w:val="a5"/>
-                <w:noProof/>
-              </w:rPr>
-              <w:t>Предварительное замечание об источниковой базе</w:t>
-            </w:r>
-            <w:r>
-              <w:rPr>
-                <w:noProof/>
-              </w:rPr>
-              <w:tab/>
-            </w:r>
-            <w:r>
-              <w:rPr>
-                <w:noProof/>
-              </w:rPr>
-              <w:fldChar w:fldCharType="begin"/>
-            </w:r>
-            <w:r>
-              <w:rPr>
-                <w:noProof/>
-              </w:rPr>
-              <w:instrText xml:space="preserve"> PAGEREF _Toc230517436 \h </w:instrText>
-            </w:r>
-            <w:r>
-              <w:rPr>
-                <w:noProof/>
-              </w:rPr>
-            </w:r>
-            <w:r>
-              <w:rPr>
-                <w:noProof/>
-              </w:rPr>
-              <w:fldChar w:fldCharType="separate"/>
-            </w:r>
-            <w:r>
-              <w:rPr>
-                <w:noProof/>
-              </w:rPr>
-              <w:t>1</w:t>
-            </w:r>
-            <w:r>
-              <w:rPr>
-                <w:noProof/>
-              </w:rPr>
-              <w:fldChar w:fldCharType="end"/>
-            </w:r>
-          </w:hyperlink>
-        </w:p>
-        <w:p>
-          <w:pPr>
-            <w:pStyle w:val="11"/>
-            <w:tabs>
-              <w:tab w:val="right" w:leader="dot" w:pos="9187"/>
-            </w:tabs>
-            <w:rPr>
-              <w:noProof/>
-            </w:rPr>
-          </w:pPr>
-          <w:hyperlink w:anchor="_Toc230517437" w:history="1">
-            <w:r>
-              <w:rPr>
-                <w:rStyle w:val="a5"/>
-                <w:noProof/>
-              </w:rPr>
-              <w:t>Раздел 1. Исторический контекст и предпосылки революции</w:t>
-            </w:r>
-            <w:r>
-              <w:rPr>
-                <w:noProof/>
-              </w:rPr>
-              <w:tab/>
-            </w:r>
-            <w:r>
-              <w:rPr>
-                <w:noProof/>
-              </w:rPr>
-              <w:fldChar w:fldCharType="begin"/>
-            </w:r>
-            <w:r>
-              <w:rPr>
-                <w:noProof/>
-              </w:rPr>
-              <w:instrText xml:space="preserve"> PAGEREF _Toc230517437 \h </w:instrText>
-            </w:r>
-            <w:r>
-              <w:rPr>
-                <w:noProof/>
-              </w:rPr>
-            </w:r>
-            <w:r>
-              <w:rPr>
-                <w:noProof/>
-              </w:rPr>
-              <w:fldChar w:fldCharType="separate"/>
-            </w:r>
-            <w:r>
-              <w:rPr>
-                <w:noProof/>
-              </w:rPr>
-              <w:t>1</w:t>
-            </w:r>
-            <w:r>
-              <w:rPr>
-                <w:noProof/>
-              </w:rPr>
-              <w:fldChar w:fldCharType="end"/>
-            </w:r>
-          </w:hyperlink>
-        </w:p>
-        <w:p>
-          <w:pPr>
-            <w:pStyle w:val="20"/>
-            <w:tabs>
-              <w:tab w:val="right" w:leader="dot" w:pos="9187"/>
-            </w:tabs>
-            <w:rPr>
-              <w:noProof/>
-            </w:rPr>
-          </w:pPr>
-          <w:hyperlink w:anchor="_Toc230517438" w:history="1">
-            <w:r>
-              <w:rPr>
-                <w:rStyle w:val="a5"/>
-                <w:noProof/>
-              </w:rPr>
-              <w:t>1.1. Положение рабочих на уральских заводах</w:t>
-            </w:r>
-            <w:r>
-              <w:rPr>
-                <w:noProof/>
-              </w:rPr>
-              <w:tab/>
-            </w:r>
-            <w:r>
-              <w:rPr>
-                <w:noProof/>
-              </w:rPr>
-              <w:fldChar w:fldCharType="begin"/>
-            </w:r>
-            <w:r>
-              <w:rPr>
-                <w:noProof/>
-              </w:rPr>
-              <w:instrText xml:space="preserve"> PAGEREF _Toc230517438 \h </w:instrText>
-            </w:r>
-            <w:r>
-              <w:rPr>
-                <w:noProof/>
-              </w:rPr>
-            </w:r>
-            <w:r>
-              <w:rPr>
-                <w:noProof/>
-              </w:rPr>
-              <w:fldChar w:fldCharType="separate"/>
-            </w:r>
-            <w:r>
-              <w:rPr>
-                <w:noProof/>
-              </w:rPr>
-              <w:t>1</w:t>
-            </w:r>
-            <w:r>
-              <w:rPr>
-                <w:noProof/>
-              </w:rPr>
-              <w:fldChar w:fldCharType="end"/>
-            </w:r>
-          </w:hyperlink>
-        </w:p>
-        <w:p>
-          <w:pPr>
-            <w:pStyle w:val="20"/>
-            <w:tabs>
-              <w:tab w:val="right" w:leader="dot" w:pos="9187"/>
-            </w:tabs>
-            <w:rPr>
-              <w:noProof/>
-            </w:rPr>
-          </w:pPr>
-          <w:hyperlink w:anchor="_Toc230517439" w:history="1">
-            <w:r>
-              <w:rPr>
-                <w:rStyle w:val="a5"/>
-                <w:noProof/>
-              </w:rPr>
-              <w:t>1.2. «Кровавое воскресенье» и его отклик на Урале</w:t>
-            </w:r>
-            <w:r>
-              <w:rPr>
-                <w:noProof/>
-              </w:rPr>
-              <w:tab/>
-            </w:r>
-            <w:r>
-              <w:rPr>
-                <w:noProof/>
-              </w:rPr>
-              <w:fldChar w:fldCharType="begin"/>
-            </w:r>
-            <w:r>
-              <w:rPr>
-                <w:noProof/>
-              </w:rPr>
-              <w:instrText xml:space="preserve"> PAGEREF _Toc230517439 \h </w:instrText>
-            </w:r>
-            <w:r>
-              <w:rPr>
-                <w:noProof/>
-              </w:rPr>
-            </w:r>
-            <w:r>
-              <w:rPr>
-                <w:noProof/>
-              </w:rPr>
-              <w:fldChar w:fldCharType="separate"/>
-            </w:r>
-            <w:r>
-              <w:rPr>
-                <w:noProof/>
-              </w:rPr>
-              <w:t>1</w:t>
-            </w:r>
-            <w:r>
-              <w:rPr>
-                <w:noProof/>
-              </w:rPr>
-              <w:fldChar w:fldCharType="end"/>
-            </w:r>
-          </w:hyperlink>
-        </w:p>
-        <w:p>
-          <w:pPr>
-            <w:pStyle w:val="20"/>
-            <w:tabs>
-              <w:tab w:val="right" w:leader="dot" w:pos="9187"/>
-            </w:tabs>
-            <w:rPr>
-              <w:noProof/>
-            </w:rPr>
-          </w:pPr>
-          <w:hyperlink w:anchor="_Toc230517440" w:history="1">
-            <w:r>
-              <w:rPr>
-                <w:rStyle w:val="a5"/>
-                <w:noProof/>
-              </w:rPr>
-              <w:t>1.3. Русско-японская война как катализатор</w:t>
-            </w:r>
-            <w:r>
-              <w:rPr>
-                <w:noProof/>
-              </w:rPr>
-              <w:tab/>
-            </w:r>
-            <w:r>
-              <w:rPr>
-                <w:noProof/>
-              </w:rPr>
-              <w:fldChar w:fldCharType="begin"/>
-            </w:r>
-            <w:r>
-              <w:rPr>
-                <w:noProof/>
-              </w:rPr>
-              <w:instrText xml:space="preserve"> PAGEREF _Toc230517440 \h </w:instrText>
-            </w:r>
-            <w:r>
-              <w:rPr>
-                <w:noProof/>
-              </w:rPr>
-            </w:r>
-            <w:r>
-              <w:rPr>
-                <w:noProof/>
-              </w:rPr>
-              <w:fldChar w:fldCharType="separate"/>
-            </w:r>
-            <w:r>
-              <w:rPr>
-                <w:noProof/>
-              </w:rPr>
-              <w:t>1</w:t>
-            </w:r>
-            <w:r>
-              <w:rPr>
-                <w:noProof/>
-              </w:rPr>
-              <w:fldChar w:fldCharType="end"/>
-            </w:r>
-          </w:hyperlink>
-        </w:p>
-        <w:p>
-          <w:pPr>
-            <w:pStyle w:val="11"/>
-            <w:tabs>
-              <w:tab w:val="right" w:leader="dot" w:pos="9187"/>
-            </w:tabs>
-            <w:rPr>
-              <w:noProof/>
-            </w:rPr>
-          </w:pPr>
-          <w:hyperlink w:anchor="_Toc230517441" w:history="1">
-            <w:r>
-              <w:rPr>
-                <w:rStyle w:val="a5"/>
-                <w:noProof/>
-              </w:rPr>
-              <w:t>Раздел 2. Екатеринбург накануне революции</w:t>
-            </w:r>
-            <w:r>
-              <w:rPr>
-                <w:noProof/>
-              </w:rPr>
-              <w:tab/>
-            </w:r>
-            <w:r>
-              <w:rPr>
-                <w:noProof/>
-              </w:rPr>
-              <w:fldChar w:fldCharType="begin"/>
-            </w:r>
-            <w:r>
-              <w:rPr>
-                <w:noProof/>
-              </w:rPr>
-              <w:instrText xml:space="preserve"> PAGEREF _Toc230517441 \h </w:instrText>
-            </w:r>
-            <w:r>
-              <w:rPr>
-                <w:noProof/>
-              </w:rPr>
-            </w:r>
-            <w:r>
-              <w:rPr>
-                <w:noProof/>
-              </w:rPr>
-              <w:fldChar w:fldCharType="separate"/>
-            </w:r>
-            <w:r>
-              <w:rPr>
-                <w:noProof/>
-              </w:rPr>
-              <w:t>1</w:t>
-            </w:r>
-            <w:r>
-              <w:rPr>
-                <w:noProof/>
-              </w:rPr>
-              <w:fldChar w:fldCharType="end"/>
-            </w:r>
-          </w:hyperlink>
-        </w:p>
-        <w:p>
-          <w:pPr>
-            <w:pStyle w:val="20"/>
-            <w:tabs>
-              <w:tab w:val="right" w:leader="dot" w:pos="9187"/>
-            </w:tabs>
-            <w:rPr>
-              <w:noProof/>
-            </w:rPr>
-          </w:pPr>
-          <w:hyperlink w:anchor="_Toc230517442" w:history="1">
-            <w:r>
-              <w:rPr>
-                <w:rStyle w:val="a5"/>
-                <w:noProof/>
-              </w:rPr>
-              <w:t>2.1. Промышленная структура города</w:t>
-            </w:r>
-            <w:r>
-              <w:rPr>
-                <w:noProof/>
-              </w:rPr>
-              <w:tab/>
-            </w:r>
-            <w:r>
-              <w:rPr>
-                <w:noProof/>
-              </w:rPr>
-              <w:fldChar w:fldCharType="begin"/>
-            </w:r>
-            <w:r>
-              <w:rPr>
-                <w:noProof/>
-              </w:rPr>
-              <w:instrText xml:space="preserve"> PAGEREF _Toc230517442 \h </w:instrText>
-            </w:r>
-            <w:r>
-              <w:rPr>
-                <w:noProof/>
-              </w:rPr>
-            </w:r>
-            <w:r>
-              <w:rPr>
-                <w:noProof/>
-              </w:rPr>
-              <w:fldChar w:fldCharType="separate"/>
-            </w:r>
-            <w:r>
-              <w:rPr>
-                <w:noProof/>
-              </w:rPr>
-              <w:t>1</w:t>
-            </w:r>
-            <w:r>
-              <w:rPr>
-                <w:noProof/>
-              </w:rPr>
-              <w:fldChar w:fldCharType="end"/>
-            </w:r>
-          </w:hyperlink>
-        </w:p>
-        <w:p>
-          <w:pPr>
-            <w:pStyle w:val="20"/>
-            <w:tabs>
-              <w:tab w:val="right" w:leader="dot" w:pos="9187"/>
-            </w:tabs>
-            <w:rPr>
-              <w:noProof/>
-            </w:rPr>
-          </w:pPr>
-          <w:hyperlink w:anchor="_Toc230517443" w:history="1">
-            <w:r>
-              <w:rPr>
-                <w:rStyle w:val="a5"/>
-                <w:noProof/>
-              </w:rPr>
-              <w:t>2.2. Нарастание стачечного движения (1900–1904)</w:t>
-            </w:r>
-            <w:r>
-              <w:rPr>
-                <w:noProof/>
-              </w:rPr>
-              <w:tab/>
-            </w:r>
-            <w:r>
-              <w:rPr>
-                <w:noProof/>
-              </w:rPr>
-              <w:fldChar w:fldCharType="begin"/>
-            </w:r>
-            <w:r>
-              <w:rPr>
-                <w:noProof/>
-              </w:rPr>
-              <w:instrText xml:space="preserve"> PAGEREF _Toc230517443 \h </w:instrText>
-            </w:r>
-            <w:r>
-              <w:rPr>
-                <w:noProof/>
-              </w:rPr>
-            </w:r>
-            <w:r>
-              <w:rPr>
-                <w:noProof/>
-              </w:rPr>
-              <w:fldChar w:fldCharType="separate"/>
-            </w:r>
-            <w:r>
-              <w:rPr>
-                <w:noProof/>
-              </w:rPr>
-              <w:t>1</w:t>
-            </w:r>
-            <w:r>
-              <w:rPr>
-                <w:noProof/>
-              </w:rPr>
-              <w:fldChar w:fldCharType="end"/>
-            </w:r>
-          </w:hyperlink>
-        </w:p>
-        <w:p>
-          <w:pPr>
-            <w:pStyle w:val="20"/>
-            <w:tabs>
-              <w:tab w:val="right" w:leader="dot" w:pos="9187"/>
-            </w:tabs>
-            <w:rPr>
-              <w:noProof/>
-            </w:rPr>
-          </w:pPr>
-          <w:hyperlink w:anchor="_Toc230517444" w:history="1">
-            <w:r>
-              <w:rPr>
-                <w:rStyle w:val="a5"/>
-                <w:noProof/>
-              </w:rPr>
-              <w:t>2.3. Революционное подполье: что нам реально известно</w:t>
-            </w:r>
-            <w:r>
-              <w:rPr>
-                <w:noProof/>
-              </w:rPr>
-              <w:tab/>
-            </w:r>
-            <w:r>
-              <w:rPr>
-                <w:noProof/>
-              </w:rPr>
-              <w:fldChar w:fldCharType="begin"/>
-            </w:r>
-            <w:r>
-              <w:rPr>
-                <w:noProof/>
-              </w:rPr>
-              <w:instrText xml:space="preserve"> PAGEREF _Toc230517444 \h </w:instrText>
-            </w:r>
-            <w:r>
-              <w:rPr>
-                <w:noProof/>
-              </w:rPr>
-            </w:r>
-            <w:r>
-              <w:rPr>
-                <w:noProof/>
-              </w:rPr>
-              <w:fldChar w:fldCharType="separate"/>
-            </w:r>
-            <w:r>
-              <w:rPr>
-                <w:noProof/>
-              </w:rPr>
-              <w:t>1</w:t>
-            </w:r>
-            <w:r>
-              <w:rPr>
-                <w:noProof/>
-              </w:rPr>
-              <w:fldChar w:fldCharType="end"/>
-            </w:r>
-          </w:hyperlink>
-        </w:p>
-        <w:p>
-          <w:pPr>
-            <w:pStyle w:val="11"/>
-            <w:tabs>
-              <w:tab w:val="right" w:leader="dot" w:pos="9187"/>
-            </w:tabs>
-            <w:rPr>
-              <w:noProof/>
-            </w:rPr>
-          </w:pPr>
-          <w:hyperlink w:anchor="_Toc230517445" w:history="1">
-            <w:r>
-              <w:rPr>
-                <w:rStyle w:val="a5"/>
-                <w:noProof/>
-              </w:rPr>
-              <w:t>Раздел 3. Хронология революционных событий</w:t>
-            </w:r>
-            <w:r>
-              <w:rPr>
-                <w:noProof/>
-              </w:rPr>
-              <w:tab/>
-            </w:r>
-            <w:r>
-              <w:rPr>
-                <w:noProof/>
-              </w:rPr>
-              <w:fldChar w:fldCharType="begin"/>
-            </w:r>
-            <w:r>
-              <w:rPr>
-                <w:noProof/>
-              </w:rPr>
-              <w:instrText xml:space="preserve"> PAGEREF _Toc230517445 \h </w:instrText>
-            </w:r>
-            <w:r>
-              <w:rPr>
-                <w:noProof/>
-              </w:rPr>
-            </w:r>
-            <w:r>
-              <w:rPr>
-                <w:noProof/>
-              </w:rPr>
-              <w:fldChar w:fldCharType="separate"/>
-            </w:r>
-            <w:r>
-              <w:rPr>
-                <w:noProof/>
-              </w:rPr>
-              <w:t>1</w:t>
-            </w:r>
-            <w:r>
-              <w:rPr>
-                <w:noProof/>
-              </w:rPr>
-              <w:fldChar w:fldCharType="end"/>
-            </w:r>
-          </w:hyperlink>
-        </w:p>
-        <w:p>
-          <w:pPr>
-            <w:pStyle w:val="20"/>
-            <w:tabs>
-              <w:tab w:val="right" w:leader="dot" w:pos="9187"/>
-            </w:tabs>
-            <w:rPr>
-              <w:noProof/>
-            </w:rPr>
-          </w:pPr>
-          <w:hyperlink w:anchor="_Toc230517446" w:history="1">
-            <w:r>
-              <w:rPr>
-                <w:rStyle w:val="a5"/>
-                <w:noProof/>
-              </w:rPr>
-              <w:t>3.1. Весна 1905: первые открытые выступления</w:t>
-            </w:r>
-            <w:r>
-              <w:rPr>
-                <w:noProof/>
-              </w:rPr>
-              <w:tab/>
-            </w:r>
-            <w:r>
-              <w:rPr>
-                <w:noProof/>
-              </w:rPr>
-              <w:fldChar w:fldCharType="begin"/>
-            </w:r>
-            <w:r>
-              <w:rPr>
-                <w:noProof/>
-              </w:rPr>
-              <w:instrText xml:space="preserve"> PAGEREF _Toc230517446 \h </w:instrText>
-            </w:r>
-            <w:r>
-              <w:rPr>
-                <w:noProof/>
-              </w:rPr>
-            </w:r>
-            <w:r>
-              <w:rPr>
-                <w:noProof/>
-              </w:rPr>
-              <w:fldChar w:fldCharType="separate"/>
-            </w:r>
-            <w:r>
-              <w:rPr>
-                <w:noProof/>
-              </w:rPr>
-              <w:t>1</w:t>
-            </w:r>
-            <w:r>
-              <w:rPr>
-                <w:noProof/>
-              </w:rPr>
-              <w:fldChar w:fldCharType="end"/>
-            </w:r>
-          </w:hyperlink>
-        </w:p>
-        <w:p>
-          <w:pPr>
-            <w:pStyle w:val="20"/>
-            <w:tabs>
-              <w:tab w:val="right" w:leader="dot" w:pos="9187"/>
-            </w:tabs>
-            <w:rPr>
-              <w:noProof/>
-            </w:rPr>
-          </w:pPr>
-          <w:hyperlink w:anchor="_Toc230517447" w:history="1">
-            <w:r>
-              <w:rPr>
-                <w:rStyle w:val="a5"/>
-                <w:noProof/>
-              </w:rPr>
-              <w:t>3.2. Май 1905: стачка на Верх-Исетском заводе</w:t>
-            </w:r>
-            <w:r>
-              <w:rPr>
-                <w:noProof/>
-              </w:rPr>
-              <w:tab/>
-            </w:r>
-            <w:r>
-              <w:rPr>
-                <w:noProof/>
-              </w:rPr>
-              <w:fldChar w:fldCharType="begin"/>
-            </w:r>
-            <w:r>
-              <w:rPr>
-                <w:noProof/>
-              </w:rPr>
-              <w:instrText xml:space="preserve"> PAGEREF _Toc230517447 \h </w:instrText>
-            </w:r>
-            <w:r>
-              <w:rPr>
-                <w:noProof/>
-              </w:rPr>
-            </w:r>
-            <w:r>
-              <w:rPr>
-                <w:noProof/>
-              </w:rPr>
-              <w:fldChar w:fldCharType="separate"/>
-            </w:r>
-            <w:r>
-              <w:rPr>
-                <w:noProof/>
-              </w:rPr>
-              <w:t>1</w:t>
-            </w:r>
-            <w:r>
-              <w:rPr>
-                <w:noProof/>
-              </w:rPr>
-              <w:fldChar w:fldCharType="end"/>
-            </w:r>
-          </w:hyperlink>
-        </w:p>
-        <w:p>
-          <w:pPr>
-            <w:pStyle w:val="20"/>
-            <w:tabs>
-              <w:tab w:val="right" w:leader="dot" w:pos="9187"/>
-            </w:tabs>
-            <w:rPr>
-              <w:noProof/>
-            </w:rPr>
-          </w:pPr>
-          <w:hyperlink w:anchor="_Toc230517448" w:history="1">
-            <w:r>
-              <w:rPr>
-                <w:rStyle w:val="a5"/>
-                <w:noProof/>
-              </w:rPr>
-              <w:t>3.3. Октябрь 1905: Манифест и его последствия</w:t>
-            </w:r>
-            <w:r>
-              <w:rPr>
-                <w:noProof/>
-              </w:rPr>
-              <w:tab/>
-            </w:r>
-            <w:r>
-              <w:rPr>
-                <w:noProof/>
-              </w:rPr>
-              <w:fldChar w:fldCharType="begin"/>
-            </w:r>
-            <w:r>
-              <w:rPr>
-                <w:noProof/>
-              </w:rPr>
-              <w:instrText xml:space="preserve"> PAGEREF _Toc230517448 \h </w:instrText>
-            </w:r>
-            <w:r>
-              <w:rPr>
-                <w:noProof/>
-              </w:rPr>
-            </w:r>
-            <w:r>
-              <w:rPr>
-                <w:noProof/>
-              </w:rPr>
-              <w:fldChar w:fldCharType="separate"/>
-            </w:r>
-            <w:r>
-              <w:rPr>
-                <w:noProof/>
-              </w:rPr>
-              <w:t>1</w:t>
-            </w:r>
-            <w:r>
-              <w:rPr>
-                <w:noProof/>
-              </w:rPr>
-              <w:fldChar w:fldCharType="end"/>
-            </w:r>
-          </w:hyperlink>
-        </w:p>
-        <w:p>
-          <w:pPr>
-            <w:pStyle w:val="20"/>
-            <w:tabs>
-              <w:tab w:val="right" w:leader="dot" w:pos="9187"/>
-            </w:tabs>
-            <w:rPr>
-              <w:noProof/>
-            </w:rPr>
-          </w:pPr>
-          <w:hyperlink w:anchor="_Toc230517449" w:history="1">
-            <w:r>
-              <w:rPr>
-                <w:rStyle w:val="a5"/>
-                <w:noProof/>
-              </w:rPr>
-              <w:t>3.4. Октябрь–ноябрь 1905: «месяц митингов»</w:t>
-            </w:r>
-            <w:r>
-              <w:rPr>
-                <w:noProof/>
-              </w:rPr>
-              <w:tab/>
-            </w:r>
-            <w:r>
-              <w:rPr>
-                <w:noProof/>
-              </w:rPr>
-              <w:fldChar w:fldCharType="begin"/>
-            </w:r>
-            <w:r>
-              <w:rPr>
-                <w:noProof/>
-              </w:rPr>
-              <w:instrText xml:space="preserve"> PAGEREF _Toc230517449 \h </w:instrText>
-            </w:r>
-            <w:r>
-              <w:rPr>
-                <w:noProof/>
-              </w:rPr>
-            </w:r>
-            <w:r>
-              <w:rPr>
-                <w:noProof/>
-              </w:rPr>
-              <w:fldChar w:fldCharType="separate"/>
-            </w:r>
-            <w:r>
-              <w:rPr>
-                <w:noProof/>
-              </w:rPr>
-              <w:t>1</w:t>
-            </w:r>
-            <w:r>
-              <w:rPr>
-                <w:noProof/>
-              </w:rPr>
-              <w:fldChar w:fldCharType="end"/>
-            </w:r>
-          </w:hyperlink>
-        </w:p>
-        <w:p>
-          <w:pPr>
-            <w:pStyle w:val="20"/>
-            <w:tabs>
-              <w:tab w:val="right" w:leader="dot" w:pos="9187"/>
-            </w:tabs>
-            <w:rPr>
-              <w:noProof/>
-            </w:rPr>
-          </w:pPr>
-          <w:hyperlink w:anchor="_Toc230517450" w:history="1">
-            <w:r>
-              <w:rPr>
-                <w:rStyle w:val="a5"/>
-                <w:noProof/>
-              </w:rPr>
-              <w:t>3.5. 19 октября 1905: погром на Кафедральной площади</w:t>
-            </w:r>
-            <w:r>
-              <w:rPr>
-                <w:noProof/>
-              </w:rPr>
-              <w:tab/>
-            </w:r>
-            <w:r>
-              <w:rPr>
-                <w:noProof/>
-              </w:rPr>
-              <w:fldChar w:fldCharType="begin"/>
-            </w:r>
-            <w:r>
-              <w:rPr>
-                <w:noProof/>
-              </w:rPr>
-              <w:instrText xml:space="preserve"> PAGEREF _Toc230517450 \h </w:instrText>
-            </w:r>
-            <w:r>
-              <w:rPr>
-                <w:noProof/>
-              </w:rPr>
-            </w:r>
-            <w:r>
-              <w:rPr>
-                <w:noProof/>
-              </w:rPr>
-              <w:fldChar w:fldCharType="separate"/>
-            </w:r>
-            <w:r>
-              <w:rPr>
-                <w:noProof/>
-              </w:rPr>
-              <w:t>1</w:t>
-            </w:r>
-            <w:r>
-              <w:rPr>
-                <w:noProof/>
-              </w:rPr>
-              <w:fldChar w:fldCharType="end"/>
-            </w:r>
-          </w:hyperlink>
-        </w:p>
-        <w:p>
-          <w:pPr>
-            <w:pStyle w:val="20"/>
-            <w:tabs>
-              <w:tab w:val="right" w:leader="dot" w:pos="9187"/>
-            </w:tabs>
-            <w:rPr>
-              <w:noProof/>
-            </w:rPr>
-          </w:pPr>
-          <w:hyperlink w:anchor="_Toc230517451" w:history="1">
-            <w:r>
-              <w:rPr>
-                <w:rStyle w:val="a5"/>
-                <w:noProof/>
-              </w:rPr>
-              <w:t>3.6. 16 ноября 1905: создание Совета рабочих депутатов</w:t>
-            </w:r>
-            <w:r>
-              <w:rPr>
-                <w:noProof/>
-              </w:rPr>
-              <w:tab/>
-            </w:r>
-            <w:r>
-              <w:rPr>
-                <w:noProof/>
-              </w:rPr>
-              <w:fldChar w:fldCharType="begin"/>
-            </w:r>
-            <w:r>
-              <w:rPr>
-                <w:noProof/>
-              </w:rPr>
-              <w:instrText xml:space="preserve"> PAGEREF _Toc230517451 \h </w:instrText>
-            </w:r>
-            <w:r>
-              <w:rPr>
-                <w:noProof/>
-              </w:rPr>
-            </w:r>
-            <w:r>
-              <w:rPr>
-                <w:noProof/>
-              </w:rPr>
-              <w:fldChar w:fldCharType="separate"/>
-            </w:r>
-            <w:r>
-              <w:rPr>
-                <w:noProof/>
-              </w:rPr>
-              <w:t>1</w:t>
-            </w:r>
-            <w:r>
-              <w:rPr>
-                <w:noProof/>
-              </w:rPr>
-              <w:fldChar w:fldCharType="end"/>
-            </w:r>
-          </w:hyperlink>
-        </w:p>
-        <w:p>
-          <w:pPr>
-            <w:pStyle w:val="20"/>
-            <w:tabs>
-              <w:tab w:val="right" w:leader="dot" w:pos="9187"/>
-            </w:tabs>
-            <w:rPr>
-              <w:noProof/>
-            </w:rPr>
-          </w:pPr>
-          <w:hyperlink w:anchor="_Toc230517452" w:history="1">
-            <w:r>
-              <w:rPr>
-                <w:rStyle w:val="a5"/>
-                <w:noProof/>
-              </w:rPr>
-              <w:t>3.7. Декабрь 1905: разгром</w:t>
-            </w:r>
-            <w:r>
-              <w:rPr>
-                <w:noProof/>
-              </w:rPr>
-              <w:tab/>
-            </w:r>
-            <w:r>
-              <w:rPr>
-                <w:noProof/>
-              </w:rPr>
-              <w:fldChar w:fldCharType="begin"/>
-            </w:r>
-            <w:r>
-              <w:rPr>
-                <w:noProof/>
-              </w:rPr>
-              <w:instrText xml:space="preserve"> PAGEREF _Toc230517452 \h </w:instrText>
-            </w:r>
-            <w:r>
-              <w:rPr>
-                <w:noProof/>
-              </w:rPr>
-            </w:r>
-            <w:r>
-              <w:rPr>
-                <w:noProof/>
-              </w:rPr>
-              <w:fldChar w:fldCharType="separate"/>
-            </w:r>
-            <w:r>
-              <w:rPr>
-                <w:noProof/>
-              </w:rPr>
-              <w:t>1</w:t>
-            </w:r>
-            <w:r>
-              <w:rPr>
-                <w:noProof/>
-              </w:rPr>
-              <w:fldChar w:fldCharType="end"/>
-            </w:r>
-          </w:hyperlink>
-        </w:p>
-        <w:p>
-          <w:pPr>
-            <w:pStyle w:val="11"/>
-            <w:tabs>
-              <w:tab w:val="right" w:leader="dot" w:pos="9187"/>
-            </w:tabs>
-            <w:rPr>
-              <w:noProof/>
-            </w:rPr>
-          </w:pPr>
-          <w:hyperlink w:anchor="_Toc230517453" w:history="1">
-            <w:r>
-              <w:rPr>
-                <w:rStyle w:val="a5"/>
-                <w:noProof/>
-              </w:rPr>
-              <w:t>Раздел 4. Последствия и значение</w:t>
-            </w:r>
-            <w:r>
-              <w:rPr>
-                <w:noProof/>
-              </w:rPr>
-              <w:tab/>
-            </w:r>
-            <w:r>
-              <w:rPr>
-                <w:noProof/>
-              </w:rPr>
-              <w:fldChar w:fldCharType="begin"/>
-            </w:r>
-            <w:r>
-              <w:rPr>
-                <w:noProof/>
-              </w:rPr>
-              <w:instrText xml:space="preserve"> PAGEREF _Toc230517453 \h </w:instrText>
-            </w:r>
-            <w:r>
-              <w:rPr>
-                <w:noProof/>
-              </w:rPr>
-            </w:r>
-            <w:r>
-              <w:rPr>
-                <w:noProof/>
-              </w:rPr>
-              <w:fldChar w:fldCharType="separate"/>
-            </w:r>
-            <w:r>
-              <w:rPr>
-                <w:noProof/>
-              </w:rPr>
-              <w:t>1</w:t>
-            </w:r>
-            <w:r>
-              <w:rPr>
-                <w:noProof/>
-              </w:rPr>
-              <w:fldChar w:fldCharType="end"/>
-            </w:r>
-          </w:hyperlink>
-        </w:p>
-        <w:p>
-          <w:pPr>
-            <w:pStyle w:val="20"/>
-            <w:tabs>
-              <w:tab w:val="right" w:leader="dot" w:pos="9187"/>
-            </w:tabs>
-            <w:rPr>
-              <w:noProof/>
-            </w:rPr>
-          </w:pPr>
-          <w:hyperlink w:anchor="_Toc230517454" w:history="1">
-            <w:r>
-              <w:rPr>
-                <w:rStyle w:val="a5"/>
-                <w:noProof/>
-              </w:rPr>
-              <w:t>4.1. Боевые дружины и репрессии</w:t>
-            </w:r>
-            <w:r>
-              <w:rPr>
-                <w:noProof/>
-              </w:rPr>
-              <w:tab/>
-            </w:r>
-            <w:r>
-              <w:rPr>
-                <w:noProof/>
-              </w:rPr>
-              <w:fldChar w:fldCharType="begin"/>
-            </w:r>
-            <w:r>
-              <w:rPr>
-                <w:noProof/>
-              </w:rPr>
-              <w:instrText xml:space="preserve"> PAGEREF _Toc230517454 \h </w:instrText>
-            </w:r>
-            <w:r>
-              <w:rPr>
-                <w:noProof/>
-              </w:rPr>
-            </w:r>
-            <w:r>
-              <w:rPr>
-                <w:noProof/>
-              </w:rPr>
-              <w:fldChar w:fldCharType="separate"/>
-            </w:r>
-            <w:r>
-              <w:rPr>
-                <w:noProof/>
-              </w:rPr>
-              <w:t>1</w:t>
-            </w:r>
-            <w:r>
-              <w:rPr>
-                <w:noProof/>
-              </w:rPr>
-              <w:fldChar w:fldCharType="end"/>
-            </w:r>
-          </w:hyperlink>
-        </w:p>
-        <w:p>
-          <w:pPr>
-            <w:pStyle w:val="20"/>
-            <w:tabs>
-              <w:tab w:val="right" w:leader="dot" w:pos="9187"/>
-            </w:tabs>
-            <w:rPr>
-              <w:noProof/>
-            </w:rPr>
-          </w:pPr>
-          <w:hyperlink w:anchor="_Toc230517455" w:history="1">
-            <w:r>
-              <w:rPr>
-                <w:rStyle w:val="a5"/>
-                <w:noProof/>
-              </w:rPr>
-              <w:t>4.2. Роль различных политических сил: постсоветская переоценка</w:t>
-            </w:r>
-            <w:r>
-              <w:rPr>
-                <w:noProof/>
-              </w:rPr>
-              <w:tab/>
-            </w:r>
-            <w:r>
-              <w:rPr>
-                <w:noProof/>
-              </w:rPr>
-              <w:fldChar w:fldCharType="begin"/>
-            </w:r>
-            <w:r>
-              <w:rPr>
-                <w:noProof/>
-              </w:rPr>
-              <w:instrText xml:space="preserve"> PAGEREF _Toc230517455 \h </w:instrText>
-            </w:r>
-            <w:r>
-              <w:rPr>
-                <w:noProof/>
-              </w:rPr>
-            </w:r>
-            <w:r>
-              <w:rPr>
-                <w:noProof/>
-              </w:rPr>
-              <w:fldChar w:fldCharType="separate"/>
-            </w:r>
-            <w:r>
-              <w:rPr>
-                <w:noProof/>
-              </w:rPr>
-              <w:t>1</w:t>
-            </w:r>
-            <w:r>
-              <w:rPr>
-                <w:noProof/>
-              </w:rPr>
-              <w:fldChar w:fldCharType="end"/>
-            </w:r>
-          </w:hyperlink>
-        </w:p>
-        <w:p>
-          <w:pPr>
-            <w:pStyle w:val="20"/>
-            <w:tabs>
-              <w:tab w:val="right" w:leader="dot" w:pos="9187"/>
-            </w:tabs>
-            <w:rPr>
-              <w:noProof/>
-            </w:rPr>
-          </w:pPr>
-          <w:hyperlink w:anchor="_Toc230517456" w:history="1">
-            <w:r>
-              <w:rPr>
-                <w:rStyle w:val="a5"/>
-                <w:noProof/>
-              </w:rPr>
-              <w:t>4.3. Топонимическое наследие</w:t>
-            </w:r>
-            <w:r>
-              <w:rPr>
-                <w:noProof/>
-              </w:rPr>
-              <w:tab/>
-            </w:r>
-            <w:r>
-              <w:rPr>
-                <w:noProof/>
-              </w:rPr>
-              <w:fldChar w:fldCharType="begin"/>
-            </w:r>
-            <w:r>
-              <w:rPr>
-                <w:noProof/>
-              </w:rPr>
-              <w:instrText xml:space="preserve"> PAGEREF _Toc230517456 \h </w:instrText>
-            </w:r>
-            <w:r>
-              <w:rPr>
-                <w:noProof/>
-              </w:rPr>
-            </w:r>
-            <w:r>
-              <w:rPr>
-                <w:noProof/>
-              </w:rPr>
-              <w:fldChar w:fldCharType="separate"/>
-            </w:r>
-            <w:r>
-              <w:rPr>
-                <w:noProof/>
-              </w:rPr>
-              <w:t>1</w:t>
-            </w:r>
-            <w:r>
-              <w:rPr>
-                <w:noProof/>
-              </w:rPr>
-              <w:fldChar w:fldCharType="end"/>
-            </w:r>
-          </w:hyperlink>
-        </w:p>
-        <w:p>
-          <w:pPr>
-            <w:pStyle w:val="20"/>
-            <w:tabs>
-              <w:tab w:val="right" w:leader="dot" w:pos="9187"/>
-            </w:tabs>
-            <w:rPr>
-              <w:noProof/>
-            </w:rPr>
-          </w:pPr>
-          <w:hyperlink w:anchor="_Toc230517457" w:history="1">
-            <w:r>
-              <w:rPr>
-                <w:rStyle w:val="a5"/>
-                <w:noProof/>
-              </w:rPr>
-              <w:t>4.4. Институциональная преемственность: от 1905 к 1917 году</w:t>
-            </w:r>
-            <w:r>
-              <w:rPr>
-                <w:noProof/>
-              </w:rPr>
-              <w:tab/>
-            </w:r>
-            <w:r>
-              <w:rPr>
-                <w:noProof/>
-              </w:rPr>
-              <w:fldChar w:fldCharType="begin"/>
-            </w:r>
-            <w:r>
-              <w:rPr>
-                <w:noProof/>
-              </w:rPr>
-              <w:instrText xml:space="preserve"> PAGEREF _Toc230517457 \h </w:instrText>
-            </w:r>
-            <w:r>
-              <w:rPr>
-                <w:noProof/>
-              </w:rPr>
-            </w:r>
-            <w:r>
-              <w:rPr>
-                <w:noProof/>
-              </w:rPr>
-              <w:fldChar w:fldCharType="separate"/>
-            </w:r>
-            <w:r>
-              <w:rPr>
-                <w:noProof/>
-              </w:rPr>
-              <w:t>1</w:t>
-            </w:r>
-            <w:r>
-              <w:rPr>
-                <w:noProof/>
-              </w:rPr>
-              <w:fldChar w:fldCharType="end"/>
-            </w:r>
-          </w:hyperlink>
-        </w:p>
-        <w:p>
-          <w:pPr>
-            <w:pStyle w:val="11"/>
-            <w:tabs>
-              <w:tab w:val="right" w:leader="dot" w:pos="9187"/>
-            </w:tabs>
-            <w:rPr>
-              <w:noProof/>
-            </w:rPr>
-          </w:pPr>
-          <w:hyperlink w:anchor="_Toc230517458" w:history="1">
-            <w:r>
-              <w:rPr>
-                <w:rStyle w:val="a5"/>
-                <w:noProof/>
-              </w:rPr>
-              <w:t>Раздел 5. Историографический анализ</w:t>
-            </w:r>
-            <w:r>
-              <w:rPr>
-                <w:noProof/>
-              </w:rPr>
-              <w:tab/>
-            </w:r>
-            <w:r>
-              <w:rPr>
-                <w:noProof/>
-              </w:rPr>
-              <w:fldChar w:fldCharType="begin"/>
-            </w:r>
-            <w:r>
-              <w:rPr>
-                <w:noProof/>
-              </w:rPr>
-              <w:instrText xml:space="preserve"> PAGEREF _Toc230517458 \h </w:instrText>
-            </w:r>
-            <w:r>
-              <w:rPr>
-                <w:noProof/>
-              </w:rPr>
-            </w:r>
-            <w:r>
-              <w:rPr>
-                <w:noProof/>
-              </w:rPr>
-              <w:fldChar w:fldCharType="separate"/>
-            </w:r>
-            <w:r>
-              <w:rPr>
-                <w:noProof/>
-              </w:rPr>
-              <w:t>1</w:t>
-            </w:r>
-            <w:r>
-              <w:rPr>
-                <w:noProof/>
-              </w:rPr>
-              <w:fldChar w:fldCharType="end"/>
-            </w:r>
-          </w:hyperlink>
-        </w:p>
-        <w:p>
-          <w:pPr>
-            <w:pStyle w:val="20"/>
-            <w:tabs>
-              <w:tab w:val="right" w:leader="dot" w:pos="9187"/>
-            </w:tabs>
-            <w:rPr>
-              <w:noProof/>
-            </w:rPr>
-          </w:pPr>
-          <w:hyperlink w:anchor="_Toc230517459" w:history="1">
-            <w:r>
-              <w:rPr>
-                <w:rStyle w:val="a5"/>
-                <w:noProof/>
-              </w:rPr>
-              <w:t>5.1. Советская историография (1920–1980-е гг.)</w:t>
-            </w:r>
-            <w:r>
-              <w:rPr>
-                <w:noProof/>
-              </w:rPr>
-              <w:tab/>
-            </w:r>
-            <w:r>
-              <w:rPr>
-                <w:noProof/>
-              </w:rPr>
-              <w:fldChar w:fldCharType="begin"/>
-            </w:r>
-            <w:r>
-              <w:rPr>
-                <w:noProof/>
-              </w:rPr>
-              <w:instrText xml:space="preserve"> PAGEREF _Toc230517459 \h </w:instrText>
-            </w:r>
-            <w:r>
-              <w:rPr>
-                <w:noProof/>
-              </w:rPr>
-            </w:r>
-            <w:r>
-              <w:rPr>
-                <w:noProof/>
-              </w:rPr>
-              <w:fldChar w:fldCharType="separate"/>
-            </w:r>
-            <w:r>
-              <w:rPr>
-                <w:noProof/>
-              </w:rPr>
-              <w:t>1</w:t>
-            </w:r>
-            <w:r>
-              <w:rPr>
-                <w:noProof/>
-              </w:rPr>
-              <w:fldChar w:fldCharType="end"/>
-            </w:r>
-          </w:hyperlink>
-        </w:p>
-        <w:p>
-          <w:pPr>
-            <w:pStyle w:val="20"/>
-            <w:tabs>
-              <w:tab w:val="right" w:leader="dot" w:pos="9187"/>
-            </w:tabs>
-            <w:rPr>
-              <w:noProof/>
-            </w:rPr>
-          </w:pPr>
-          <w:hyperlink w:anchor="_Toc230517460" w:history="1">
-            <w:r>
-              <w:rPr>
-                <w:rStyle w:val="a5"/>
-                <w:noProof/>
-              </w:rPr>
-              <w:t>5.2. Постсоветская историография (с 1991 г.)</w:t>
-            </w:r>
-            <w:r>
-              <w:rPr>
-                <w:noProof/>
-              </w:rPr>
-              <w:tab/>
-            </w:r>
-            <w:r>
-              <w:rPr>
-                <w:noProof/>
-              </w:rPr>
-              <w:fldChar w:fldCharType="begin"/>
-            </w:r>
-            <w:r>
-              <w:rPr>
-                <w:noProof/>
-              </w:rPr>
-              <w:instrText xml:space="preserve"> PAGEREF _Toc230517460 \h </w:instrText>
-            </w:r>
-            <w:r>
-              <w:rPr>
-                <w:noProof/>
-              </w:rPr>
-            </w:r>
-            <w:r>
-              <w:rPr>
-                <w:noProof/>
-              </w:rPr>
-              <w:fldChar w:fldCharType="separate"/>
-            </w:r>
-            <w:r>
-              <w:rPr>
-                <w:noProof/>
-              </w:rPr>
-              <w:t>1</w:t>
-            </w:r>
-            <w:r>
-              <w:rPr>
-                <w:noProof/>
-              </w:rPr>
-              <w:fldChar w:fldCharType="end"/>
-            </w:r>
-          </w:hyperlink>
-        </w:p>
-        <w:p>
-          <w:pPr>
-            <w:pStyle w:val="20"/>
-            <w:tabs>
-              <w:tab w:val="right" w:leader="dot" w:pos="9187"/>
-            </w:tabs>
-            <w:rPr>
-              <w:noProof/>
-            </w:rPr>
-          </w:pPr>
-          <w:hyperlink w:anchor="_Toc230517461" w:history="1">
-            <w:r>
-              <w:rPr>
-                <w:rStyle w:val="a5"/>
-                <w:noProof/>
-              </w:rPr>
-              <w:t>5.3. «Генеральная репетиция»: метафора или верифицируемый вывод?</w:t>
-            </w:r>
-            <w:r>
-              <w:rPr>
-                <w:noProof/>
-              </w:rPr>
-              <w:tab/>
-            </w:r>
-            <w:r>
-              <w:rPr>
-                <w:noProof/>
-              </w:rPr>
-              <w:fldChar w:fldCharType="begin"/>
-            </w:r>
-            <w:r>
-              <w:rPr>
-                <w:noProof/>
-              </w:rPr>
-              <w:instrText xml:space="preserve"> PAGEREF _Toc230517461 \h </w:instrText>
-            </w:r>
-            <w:r>
-              <w:rPr>
-                <w:noProof/>
-              </w:rPr>
-            </w:r>
-            <w:r>
-              <w:rPr>
-                <w:noProof/>
-              </w:rPr>
-              <w:fldChar w:fldCharType="separate"/>
-            </w:r>
-            <w:r>
-              <w:rPr>
-                <w:noProof/>
-              </w:rPr>
-              <w:t>1</w:t>
-            </w:r>
-            <w:r>
-              <w:rPr>
-                <w:noProof/>
-              </w:rPr>
-              <w:fldChar w:fldCharType="end"/>
-            </w:r>
-          </w:hyperlink>
-        </w:p>
-        <w:p>
-          <w:pPr>
-            <w:pStyle w:val="11"/>
-            <w:tabs>
-              <w:tab w:val="right" w:leader="dot" w:pos="9187"/>
-            </w:tabs>
-            <w:rPr>
-              <w:noProof/>
-            </w:rPr>
-          </w:pPr>
-          <w:hyperlink w:anchor="_Toc230517462" w:history="1">
-            <w:r>
-              <w:rPr>
-                <w:rStyle w:val="a5"/>
-                <w:noProof/>
-              </w:rPr>
-              <w:t>Выводы</w:t>
-            </w:r>
-            <w:r>
-              <w:rPr>
-                <w:noProof/>
-              </w:rPr>
-              <w:tab/>
-            </w:r>
-            <w:r>
-              <w:rPr>
-                <w:noProof/>
-              </w:rPr>
-              <w:fldChar w:fldCharType="begin"/>
-            </w:r>
-            <w:r>
-              <w:rPr>
-                <w:noProof/>
-              </w:rPr>
-              <w:instrText xml:space="preserve"> PAGEREF _Toc230517462 \h </w:instrText>
-            </w:r>
-            <w:r>
-              <w:rPr>
-                <w:noProof/>
-              </w:rPr>
-            </w:r>
-            <w:r>
-              <w:rPr>
-                <w:noProof/>
-              </w:rPr>
-              <w:fldChar w:fldCharType="separate"/>
-            </w:r>
-            <w:r>
-              <w:rPr>
-                <w:noProof/>
-              </w:rPr>
-              <w:t>1</w:t>
-            </w:r>
-            <w:r>
-              <w:rPr>
-                <w:noProof/>
-              </w:rPr>
-              <w:fldChar w:fldCharType="end"/>
-            </w:r>
-          </w:hyperlink>
-        </w:p>
-        <w:p>
-          <w:pPr>
-            <w:pStyle w:val="11"/>
-            <w:tabs>
-              <w:tab w:val="right" w:leader="dot" w:pos="9187"/>
-            </w:tabs>
-            <w:rPr>
-              <w:noProof/>
-            </w:rPr>
-          </w:pPr>
-          <w:hyperlink w:anchor="_Toc230517463" w:history="1">
-            <w:r>
-              <w:rPr>
-                <w:rStyle w:val="a5"/>
-                <w:noProof/>
-              </w:rPr>
-              <w:t>Список источников и литературы</w:t>
-            </w:r>
-            <w:r>
-              <w:rPr>
-                <w:noProof/>
-              </w:rPr>
-              <w:tab/>
-            </w:r>
-            <w:r>
-              <w:rPr>
-                <w:noProof/>
-              </w:rPr>
-              <w:fldChar w:fldCharType="begin"/>
-            </w:r>
-            <w:r>
-              <w:rPr>
-                <w:noProof/>
-              </w:rPr>
-              <w:instrText xml:space="preserve"> PAGEREF _Toc230517463 \h </w:instrText>
-            </w:r>
-            <w:r>
-              <w:rPr>
-                <w:noProof/>
-              </w:rPr>
-            </w:r>
-            <w:r>
-              <w:rPr>
-                <w:noProof/>
-              </w:rPr>
-              <w:fldChar w:fldCharType="separate"/>
-            </w:r>
-            <w:r>
-              <w:rPr>
-                <w:noProof/>
-              </w:rPr>
-              <w:t>1</w:t>
-            </w:r>
-            <w:r>
-              <w:rPr>
-                <w:noProof/>
-              </w:rPr>
-              <w:fldChar w:fldCharType="end"/>
-            </w:r>
-          </w:hyperlink>
-        </w:p>
-        <w:p>
-          <w:pPr>
-            <w:pStyle w:val="20"/>
-            <w:tabs>
-              <w:tab w:val="right" w:leader="dot" w:pos="9187"/>
-            </w:tabs>
-            <w:rPr>
-              <w:noProof/>
-            </w:rPr>
-          </w:pPr>
-          <w:hyperlink w:anchor="_Toc230517464" w:history="1">
-            <w:r>
-              <w:rPr>
-                <w:rStyle w:val="a5"/>
-                <w:noProof/>
-              </w:rPr>
-              <w:t>I. Документальные сборники</w:t>
-            </w:r>
-            <w:r>
-              <w:rPr>
-                <w:noProof/>
-              </w:rPr>
-              <w:tab/>
-            </w:r>
-            <w:r>
-              <w:rPr>
-                <w:noProof/>
-              </w:rPr>
-              <w:fldChar w:fldCharType="begin"/>
-            </w:r>
-            <w:r>
-              <w:rPr>
-                <w:noProof/>
-              </w:rPr>
-              <w:instrText xml:space="preserve"> PAGEREF _Toc230517464 \h </w:instrText>
-            </w:r>
-            <w:r>
-              <w:rPr>
-                <w:noProof/>
-              </w:rPr>
-            </w:r>
-            <w:r>
-              <w:rPr>
-                <w:noProof/>
-              </w:rPr>
-              <w:fldChar w:fldCharType="separate"/>
-            </w:r>
-            <w:r>
-              <w:rPr>
-                <w:noProof/>
-              </w:rPr>
-              <w:t>1</w:t>
-            </w:r>
-            <w:r>
-              <w:rPr>
-                <w:noProof/>
-              </w:rPr>
-              <w:fldChar w:fldCharType="end"/>
-            </w:r>
-          </w:hyperlink>
-        </w:p>
-        <w:p>
-          <w:pPr>
-            <w:pStyle w:val="20"/>
-            <w:tabs>
-              <w:tab w:val="right" w:leader="dot" w:pos="9187"/>
-            </w:tabs>
-            <w:rPr>
-              <w:noProof/>
-            </w:rPr>
-          </w:pPr>
-          <w:hyperlink w:anchor="_Toc230517465" w:history="1">
-            <w:r>
-              <w:rPr>
-                <w:rStyle w:val="a5"/>
-                <w:noProof/>
-              </w:rPr>
-              <w:t>II. Монографии</w:t>
-            </w:r>
-            <w:r>
-              <w:rPr>
-                <w:noProof/>
-              </w:rPr>
-              <w:tab/>
-            </w:r>
-            <w:r>
-              <w:rPr>
-                <w:noProof/>
-              </w:rPr>
-              <w:fldChar w:fldCharType="begin"/>
-            </w:r>
-            <w:r>
-              <w:rPr>
-                <w:noProof/>
-              </w:rPr>
-              <w:instrText xml:space="preserve"> PAGEREF _Toc230517465 \h </w:instrText>
-            </w:r>
-            <w:r>
-              <w:rPr>
-                <w:noProof/>
-              </w:rPr>
-            </w:r>
-            <w:r>
-              <w:rPr>
-                <w:noProof/>
-              </w:rPr>
-              <w:fldChar w:fldCharType="separate"/>
-            </w:r>
-            <w:r>
-              <w:rPr>
-                <w:noProof/>
-              </w:rPr>
-              <w:t>1</w:t>
-            </w:r>
-            <w:r>
-              <w:rPr>
-                <w:noProof/>
-              </w:rPr>
-              <w:fldChar w:fldCharType="end"/>
-            </w:r>
-          </w:hyperlink>
-        </w:p>
-        <w:p>
-          <w:pPr>
-            <w:pStyle w:val="20"/>
-            <w:tabs>
-              <w:tab w:val="right" w:leader="dot" w:pos="9187"/>
-            </w:tabs>
-            <w:rPr>
-              <w:noProof/>
-            </w:rPr>
-          </w:pPr>
-          <w:hyperlink w:anchor="_Toc230517466" w:history="1">
-            <w:r>
-              <w:rPr>
-                <w:rStyle w:val="a5"/>
-                <w:noProof/>
-              </w:rPr>
-              <w:t>III. Научные статьи</w:t>
-            </w:r>
-            <w:r>
-              <w:rPr>
-                <w:noProof/>
-              </w:rPr>
-              <w:tab/>
-            </w:r>
-            <w:r>
-              <w:rPr>
-                <w:noProof/>
-              </w:rPr>
-              <w:fldChar w:fldCharType="begin"/>
-            </w:r>
-            <w:r>
-              <w:rPr>
-                <w:noProof/>
-              </w:rPr>
-              <w:instrText xml:space="preserve"> PAGEREF _Toc230517466 \h </w:instrText>
-            </w:r>
-            <w:r>
-              <w:rPr>
-                <w:noProof/>
-              </w:rPr>
-            </w:r>
-            <w:r>
-              <w:rPr>
-                <w:noProof/>
-              </w:rPr>
-              <w:fldChar w:fldCharType="separate"/>
-            </w:r>
-            <w:r>
-              <w:rPr>
-                <w:noProof/>
-              </w:rPr>
-              <w:t>1</w:t>
-            </w:r>
-            <w:r>
-              <w:rPr>
-                <w:noProof/>
-              </w:rPr>
-              <w:fldChar w:fldCharType="end"/>
-            </w:r>
-          </w:hyperlink>
-        </w:p>
-        <w:p>
-          <w:r>
-            <w:fldChar w:fldCharType="end"/>
-          </w:r>
-        </w:p>
-      </w:sdtContent>
-    </w:sdt>
-    <w:p>
-      <w:r>
-        <w:br w:type="page"/>
-      </w:r>
-    </w:p>
-    <w:p>
-      <w:pPr>
         <w:pStyle w:val="1"/>
       </w:pPr>
-      <w:bookmarkStart w:id="0" w:name="_Toc230517436"/>
       <w:r>
         <w:lastRenderedPageBreak/>
         <w:t>Предварительное замечание об источниковой базе</w:t>
       </w:r>
-      <w:bookmarkEnd w:id="0"/>
     </w:p>
     <w:p>
       <w:pPr>
@@ -2171,56 +246,63 @@
     </w:p>
     <w:p>
       <w:pPr>
+        <w:spacing w:before="120"/>
+        <w:ind w:firstLine="708"/>
+      </w:pPr>
+      <w:r>
+        <w:t xml:space="preserve">Прямые ссылки на архивные фонды (ГАСО, ГАПК, ЦДООСО) в тексте работы не приводятся, поскольку автор не проводил самостоятельную работу в читальных залах указанных архивов. Все упоминания архивных материалов даны исключительно через опубликованные научные издания (монографии </w:t>
+      </w:r>
+      <w:proofErr w:type="gramStart"/>
+      <w:r>
+        <w:t>А.В.</w:t>
+      </w:r>
+      <w:proofErr w:type="gramEnd"/>
+      <w:r>
+        <w:t xml:space="preserve"> Чернова, статьи В.П. </w:t>
+      </w:r>
+      <w:proofErr w:type="spellStart"/>
+      <w:r>
+        <w:t>Микитюка</w:t>
+      </w:r>
+      <w:proofErr w:type="spellEnd"/>
+      <w:r>
+        <w:t>, документальные сборники 1956 и 1981 гг.), в которых исследователи уже ввели эти документы в научный оборот. Такой подход обеспечивает академическую прозрачность и исключает имитацию первичного источниковедческого поиска.</w:t>
+      </w:r>
+    </w:p>
+    <w:p>
+      <w:pPr>
+        <w:pStyle w:val="1"/>
+      </w:pPr>
+      <w:r>
+        <w:t>Раздел 1. Исторический контекст и предпосылки революции</w:t>
+      </w:r>
+    </w:p>
+    <w:p>
+      <w:pPr>
+        <w:pStyle w:val="2"/>
+      </w:pPr>
+      <w:r>
+        <w:t>1.1. Положение рабочих на уральских заводах</w:t>
+      </w:r>
+    </w:p>
+    <w:p>
+      <w:pPr>
         <w:spacing w:after="120" w:line="360" w:lineRule="auto"/>
         <w:ind w:firstLine="720"/>
         <w:jc w:val="both"/>
       </w:pPr>
       <w:r>
-        <w:t xml:space="preserve">Ссылки на архивные фонды (ГАСО, ГАПК, ЦДООСО) в тексте работы </w:t>
-      </w:r>
-      <w:r>
-        <w:rPr>
-          <w:b/>
-          <w:bCs/>
-        </w:rPr>
-        <w:t>не приводятся</w:t>
-      </w:r>
-      <w:r>
-        <w:t xml:space="preserve"> — поскольку автор не имел возможности работать в читальных залах указанных архивов. Там, где исследователи-историки (Чернов А.В., </w:t>
-      </w:r>
-      <w:proofErr w:type="spellStart"/>
-      <w:r>
-        <w:t>Микитюк</w:t>
-      </w:r>
-      <w:proofErr w:type="spellEnd"/>
-      <w:r>
-        <w:t xml:space="preserve"> В.П.) опираются на архивные материалы, их выводы цитируются с указанием на соответствующие научные публикации. Такой подход честнее, чем воспроизведение вторичных ссылок под видом самостоятельно верифицированных данных.</w:t>
-      </w:r>
-    </w:p>
-    <w:p>
-      <w:pPr>
-        <w:spacing w:before="120"/>
-      </w:pPr>
-    </w:p>
-    <w:p>
-      <w:pPr>
-        <w:pStyle w:val="1"/>
-      </w:pPr>
-      <w:bookmarkStart w:id="1" w:name="_Toc230517437"/>
-      <w:r>
-        <w:t>Раздел 1. Исторический контекст и предпосылки революции</w:t>
-      </w:r>
-      <w:bookmarkEnd w:id="1"/>
-    </w:p>
-    <w:p>
-      <w:pPr>
-        <w:pStyle w:val="2"/>
-      </w:pPr>
-      <w:bookmarkStart w:id="2" w:name="_Toc230517438"/>
-      <w:r>
-        <w:t>1.1. Положение рабочих на уральских заводах</w:t>
-      </w:r>
-      <w:bookmarkEnd w:id="2"/>
+        <w:t>К 1905 году условия труда на металлургических предприятиях Урала оставались крайне тяжёлыми. По данным, переизданным в документальном сборнике «Рабочее движение на Урале в годы Первой русской революции»</w:t>
+      </w:r>
+      <w:r>
+        <w:rPr>
+          <w:rStyle w:val="a6"/>
+        </w:rPr>
+        <w:footnoteReference w:id="1"/>
+      </w:r>
+      <w:r>
+        <w:t>, рабочий день на горнозаводских предприятиях составлял 11–14 часов в зависимости от типа производства: у доменных печей — 12 часов посменно, у прокатных станов — не менее 11 часов; сверхурочные работы включались в сдельную расценку и отдельно не оплачивались.</w:t>
+      </w:r>
     </w:p>
     <w:p>
       <w:pPr>
@@ -2229,16 +311,33 @@
         <w:jc w:val="both"/>
       </w:pPr>
       <w:r>
-        <w:t>К 1905 году условия труда на металлургических предприятиях Урала оставались крайне тяжёлыми. По данным, переизданным в документальном сборнике «Рабочее движение на Урале в годы Первой русской революции»</w:t>
+        <w:t>Промышленный кризис 1900–1903 годов тяжело ударил по всему горнозаводскому Уралу. По сводным данным сборника «Большевики Среднего Урала»</w:t>
       </w:r>
       <w:r>
         <w:rPr>
           <w:rStyle w:val="a6"/>
         </w:rPr>
-        <w:footnoteReference w:id="1"/>
-      </w:r>
-      <w:r>
-        <w:t>, рабочий день на горнозаводских предприятиях составлял 11–14 часов в зависимости от типа производства: у доменных печей — 12 часов посменно, у прокатных станов — не менее 11 часов; сверхурочные работы включались в сдельную расценку и отдельно не оплачивались.</w:t>
+        <w:footnoteReference w:id="2"/>
+      </w:r>
+      <w:r>
+        <w:t xml:space="preserve">, за 1900–1904 годы число рабочих на уральских заводах сократилось приблизительно на 20–25% по </w:t>
+      </w:r>
+      <w:r>
+        <w:lastRenderedPageBreak/>
+        <w:t>сравнению с 1899 годом; ряд предприятий перешёл на неполную загрузку. Для Екатеринбурга конкретная пообъектная разбивка в доступных опубликованных источниках не приводится.</w:t>
+      </w:r>
+    </w:p>
+    <w:p>
+      <w:pPr>
+        <w:spacing w:before="120"/>
+      </w:pPr>
+    </w:p>
+    <w:p>
+      <w:pPr>
+        <w:pStyle w:val="2"/>
+      </w:pPr>
+      <w:r>
+        <w:t>1.2. «Кровавое воскресенье» и его отклик на Урале</w:t>
       </w:r>
     </w:p>
     <w:p>
@@ -2248,20 +347,16 @@
         <w:jc w:val="both"/>
       </w:pPr>
       <w:r>
-        <w:t>Промышленный кризис 1900–1903 годов тяжело ударил по всему горнозаводскому Уралу. По сводным данным сборника «Большевики Среднего Урала»</w:t>
+        <w:t>Расстрел мирного шествия в Петербурге 9 января 1905 года стал переломным моментом. По оценке В.Я. Лаверычева</w:t>
       </w:r>
       <w:r>
         <w:rPr>
           <w:rStyle w:val="a6"/>
         </w:rPr>
-        <w:footnoteReference w:id="2"/>
-      </w:r>
-      <w:r>
-        <w:t xml:space="preserve">, за 1900–1904 годы </w:t>
-      </w:r>
-      <w:r>
-        <w:lastRenderedPageBreak/>
-        <w:t>число рабочих на уральских заводах сократилось приблизительно на 20–25% по сравнению с 1899 годом; ряд предприятий перешёл на неполную загрузку. Для Екатеринбурга конкретная пообъектная разбивка в доступных опубликованных источниках не приводится.</w:t>
+        <w:footnoteReference w:id="3"/>
+      </w:r>
+      <w:r>
+        <w:t>, только в январе 1905 года число бастующих по всей России превысило 440 тысяч человек — больше, чем за всё предшествующее десятилетие. Известие о петербургских событиях достигло Екатеринбурга в течение нескольких дней и немедленно было использовано местными революционными организациями для агитационной работы.</w:t>
       </w:r>
     </w:p>
     <w:p>
@@ -2273,11 +368,9 @@
       <w:pPr>
         <w:pStyle w:val="2"/>
       </w:pPr>
-      <w:bookmarkStart w:id="3" w:name="_Toc230517439"/>
-      <w:r>
-        <w:t>1.2. «Кровавое воскресенье» и его отклик на Урале</w:t>
-      </w:r>
-      <w:bookmarkEnd w:id="3"/>
+      <w:r>
+        <w:t>1.3. Русско-японская война как катализатор</w:t>
+      </w:r>
     </w:p>
     <w:p>
       <w:pPr>
@@ -2286,16 +379,7 @@
         <w:jc w:val="both"/>
       </w:pPr>
       <w:r>
-        <w:t>Расстрел мирного шествия в Петербурге 9 января 1905 года стал переломным моментом. По оценке В.Я. Лаверычева</w:t>
-      </w:r>
-      <w:r>
-        <w:rPr>
-          <w:rStyle w:val="a6"/>
-        </w:rPr>
-        <w:footnoteReference w:id="3"/>
-      </w:r>
-      <w:r>
-        <w:t>, только в январе 1905 года число бастующих по всей России превысило 440 тысяч человек — больше, чем за всё предшествующее десятилетие. Известие о петербургских событиях достигло Екатеринбурга в течение нескольких дней и немедленно было использовано местными революционными организациями для агитационной работы.</w:t>
+        <w:t>Поражения на Дальнем Востоке (сдача Порт-Артура в декабре 1904 г., разгром при Мукдене в феврале 1905 г.) подорвали военный престиж самодержавия. На Урале горные заводы переводились на военные заказы, что усиливало интенсивность труда без роста заработка. Призывы запасных из рабочих семей обострили жилищный и продовольственный вопросы в заводских посёлках.</w:t>
       </w:r>
     </w:p>
     <w:p>
@@ -2305,13 +389,19 @@
     </w:p>
     <w:p>
       <w:pPr>
+        <w:pStyle w:val="1"/>
+      </w:pPr>
+      <w:r>
+        <w:t>Раздел 2. Екатеринбург накануне революции</w:t>
+      </w:r>
+    </w:p>
+    <w:p>
+      <w:pPr>
         <w:pStyle w:val="2"/>
       </w:pPr>
-      <w:bookmarkStart w:id="4" w:name="_Toc230517440"/>
-      <w:r>
-        <w:t>1.3. Русско-японская война как катализатор</w:t>
-      </w:r>
-      <w:bookmarkEnd w:id="4"/>
+      <w:r>
+        <w:t>2.1. Промышленная структура города</w:t>
+      </w:r>
     </w:p>
     <w:p>
       <w:pPr>
@@ -2320,52 +410,20 @@
         <w:jc w:val="both"/>
       </w:pPr>
       <w:r>
-        <w:t>Поражения на Дальнем Востоке (сдача Порт-Артура в декабре 1904 г., разгром при Мукдене в феврале 1905 г.) подорвали военный престиж самодержавия. На Урале горные заводы переводились на военные заказы, что усиливало интенсивность труда без роста заработка. Призывы запасных из рабочих семей обострили жилищный и продовольственный вопросы в заводских посёлках.</w:t>
-      </w:r>
-    </w:p>
-    <w:p>
-      <w:pPr>
-        <w:spacing w:before="120"/>
-      </w:pPr>
-    </w:p>
-    <w:p>
-      <w:pPr>
-        <w:pStyle w:val="1"/>
-      </w:pPr>
-      <w:bookmarkStart w:id="5" w:name="_Toc230517441"/>
-      <w:r>
-        <w:t>Раздел 2. Екатеринбург накануне революции</w:t>
-      </w:r>
-      <w:bookmarkEnd w:id="5"/>
-    </w:p>
-    <w:p>
-      <w:pPr>
-        <w:pStyle w:val="2"/>
-      </w:pPr>
-      <w:bookmarkStart w:id="6" w:name="_Toc230517442"/>
-      <w:r>
-        <w:t>2.1. Промышленная структура города</w:t>
-      </w:r>
-      <w:bookmarkEnd w:id="6"/>
-    </w:p>
-    <w:p>
-      <w:pPr>
-        <w:spacing w:after="120" w:line="360" w:lineRule="auto"/>
-        <w:ind w:firstLine="720"/>
-        <w:jc w:val="both"/>
-      </w:pPr>
+        <w:t>По данным Обзора Пермской губернии за 1904 год</w:t>
+      </w:r>
+      <w:r>
+        <w:rPr>
+          <w:rStyle w:val="a6"/>
+        </w:rPr>
+        <w:footnoteReference w:id="4"/>
+      </w:r>
+      <w:r>
+        <w:t xml:space="preserve">, Екатеринбург являлся крупнейшим торгово-промышленным центром губернии. Основу промышленности </w:t>
+      </w:r>
       <w:r>
         <w:lastRenderedPageBreak/>
-        <w:t>По данным Обзора Пермской губернии за 1904 год</w:t>
-      </w:r>
-      <w:r>
-        <w:rPr>
-          <w:rStyle w:val="a6"/>
-        </w:rPr>
-        <w:footnoteReference w:id="4"/>
-      </w:r>
-      <w:r>
-        <w:t>, Екатеринбург являлся крупнейшим торгово-промышленным центром губернии. Основу промышленности составляли несколько крупных предприятий, из которых ВИЗ (Верх-Исетский металлургический завод) занимал господствующее положение по числу занятых.</w:t>
+        <w:t>составляли несколько крупных предприятий, из которых ВИЗ (Верх-Исетский металлургический завод) занимал господствующее положение по числу занятых.</w:t>
       </w:r>
     </w:p>
     <w:p>
@@ -2388,7 +446,7 @@
           <w:left w:w="10" w:type="dxa"/>
           <w:right w:w="10" w:type="dxa"/>
         </w:tblCellMar>
-        <w:tblLook w:val="04A0" w:firstRow="1" w:lastRow="0" w:firstColumn="1" w:lastColumn="0" w:noHBand="0" w:noVBand="1"/>
+        <w:tblLook w:val="0000" w:firstRow="0" w:lastRow="0" w:firstColumn="0" w:lastColumn="0" w:noHBand="0" w:noVBand="0"/>
       </w:tblPr>
       <w:tblGrid>
         <w:gridCol w:w="3200"/>
@@ -2397,12 +455,6 @@
         <w:gridCol w:w="1900"/>
       </w:tblGrid>
       <w:tr>
-        <w:tblPrEx>
-          <w:tblCellMar>
-            <w:top w:w="0" w:type="dxa"/>
-            <w:bottom w:w="0" w:type="dxa"/>
-          </w:tblCellMar>
-        </w:tblPrEx>
         <w:trPr>
           <w:tblHeader/>
         </w:trPr>
@@ -2566,12 +618,6 @@
         </w:tc>
       </w:tr>
       <w:tr>
-        <w:tblPrEx>
-          <w:tblCellMar>
-            <w:top w:w="0" w:type="dxa"/>
-            <w:bottom w:w="0" w:type="dxa"/>
-          </w:tblCellMar>
-        </w:tblPrEx>
         <w:tc>
           <w:tcPr>
             <w:tcW w:w="3200" w:type="dxa"/>
@@ -2691,12 +737,6 @@
         </w:tc>
       </w:tr>
       <w:tr>
-        <w:tblPrEx>
-          <w:tblCellMar>
-            <w:top w:w="0" w:type="dxa"/>
-            <w:bottom w:w="0" w:type="dxa"/>
-          </w:tblCellMar>
-        </w:tblPrEx>
         <w:tc>
           <w:tcPr>
             <w:tcW w:w="3200" w:type="dxa"/>
@@ -2816,12 +856,6 @@
         </w:tc>
       </w:tr>
       <w:tr>
-        <w:tblPrEx>
-          <w:tblCellMar>
-            <w:top w:w="0" w:type="dxa"/>
-            <w:bottom w:w="0" w:type="dxa"/>
-          </w:tblCellMar>
-        </w:tblPrEx>
         <w:tc>
           <w:tcPr>
             <w:tcW w:w="3200" w:type="dxa"/>
@@ -2959,12 +993,6 @@
         </w:tc>
       </w:tr>
       <w:tr>
-        <w:tblPrEx>
-          <w:tblCellMar>
-            <w:top w:w="0" w:type="dxa"/>
-            <w:bottom w:w="0" w:type="dxa"/>
-          </w:tblCellMar>
-        </w:tblPrEx>
         <w:tc>
           <w:tcPr>
             <w:tcW w:w="3200" w:type="dxa"/>
@@ -3087,7 +1115,16 @@
     <w:p>
       <w:pPr>
         <w:spacing w:before="80"/>
-      </w:pPr>
+        <w:rPr>
+          <w:vertAlign w:val="superscript"/>
+        </w:rPr>
+      </w:pPr>
+      <w:r>
+        <w:rPr>
+          <w:vertAlign w:val="superscript"/>
+        </w:rPr>
+        <w:t>Источник: Обзор Пермской губернии за 1904 год / Пермский губернский статистический комитет. Пермь, 1905. С. 42–48. Данные о заработной плате приведены в диапазонах, зафиксированных в статистическом обзоре.</w:t>
+      </w:r>
     </w:p>
     <w:p>
       <w:pPr>
@@ -3095,6 +1132,13 @@
         <w:ind w:firstLine="720"/>
         <w:jc w:val="both"/>
       </w:pPr>
+    </w:p>
+    <w:p>
+      <w:pPr>
+        <w:spacing w:after="120" w:line="360" w:lineRule="auto"/>
+        <w:ind w:firstLine="720"/>
+        <w:jc w:val="both"/>
+      </w:pPr>
       <w:r>
         <w:t xml:space="preserve">Данные таблицы приведены по Обзору Пермской губернии за 1904 год (С. 42–48). Сведения о числе рабочих дней в году в источнике </w:t>
       </w:r>
@@ -3125,11 +1169,9 @@
       <w:pPr>
         <w:pStyle w:val="2"/>
       </w:pPr>
-      <w:bookmarkStart w:id="7" w:name="_Toc230517443"/>
       <w:r>
         <w:t>2.2. Нарастание стачечного движения (1900–1904)</w:t>
       </w:r>
-      <w:bookmarkEnd w:id="7"/>
     </w:p>
     <w:p>
       <w:pPr>
@@ -3170,7 +1212,7 @@
           <w:left w:w="10" w:type="dxa"/>
           <w:right w:w="10" w:type="dxa"/>
         </w:tblCellMar>
-        <w:tblLook w:val="04A0" w:firstRow="1" w:lastRow="0" w:firstColumn="1" w:lastColumn="0" w:noHBand="0" w:noVBand="1"/>
+        <w:tblLook w:val="0000" w:firstRow="0" w:lastRow="0" w:firstColumn="0" w:lastColumn="0" w:noHBand="0" w:noVBand="0"/>
       </w:tblPr>
       <w:tblGrid>
         <w:gridCol w:w="2400"/>
@@ -3178,12 +1220,6 @@
         <w:gridCol w:w="3000"/>
       </w:tblGrid>
       <w:tr>
-        <w:tblPrEx>
-          <w:tblCellMar>
-            <w:top w:w="0" w:type="dxa"/>
-            <w:bottom w:w="0" w:type="dxa"/>
-          </w:tblCellMar>
-        </w:tblPrEx>
         <w:trPr>
           <w:tblHeader/>
         </w:trPr>
@@ -3291,12 +1327,6 @@
         </w:tc>
       </w:tr>
       <w:tr>
-        <w:tblPrEx>
-          <w:tblCellMar>
-            <w:top w:w="0" w:type="dxa"/>
-            <w:bottom w:w="0" w:type="dxa"/>
-          </w:tblCellMar>
-        </w:tblPrEx>
         <w:tc>
           <w:tcPr>
             <w:tcW w:w="2400" w:type="dxa"/>
@@ -3389,12 +1419,6 @@
         </w:tc>
       </w:tr>
       <w:tr>
-        <w:tblPrEx>
-          <w:tblCellMar>
-            <w:top w:w="0" w:type="dxa"/>
-            <w:bottom w:w="0" w:type="dxa"/>
-          </w:tblCellMar>
-        </w:tblPrEx>
         <w:tc>
           <w:tcPr>
             <w:tcW w:w="2400" w:type="dxa"/>
@@ -3418,7 +1442,6 @@
                 <w:sz w:val="20"/>
                 <w:szCs w:val="20"/>
               </w:rPr>
-              <w:lastRenderedPageBreak/>
               <w:t>1901</w:t>
             </w:r>
           </w:p>
@@ -3497,12 +1520,6 @@
         </w:tc>
       </w:tr>
       <w:tr>
-        <w:tblPrEx>
-          <w:tblCellMar>
-            <w:top w:w="0" w:type="dxa"/>
-            <w:bottom w:w="0" w:type="dxa"/>
-          </w:tblCellMar>
-        </w:tblPrEx>
         <w:tc>
           <w:tcPr>
             <w:tcW w:w="2400" w:type="dxa"/>
@@ -3604,12 +1621,6 @@
         </w:tc>
       </w:tr>
       <w:tr>
-        <w:tblPrEx>
-          <w:tblCellMar>
-            <w:top w:w="0" w:type="dxa"/>
-            <w:bottom w:w="0" w:type="dxa"/>
-          </w:tblCellMar>
-        </w:tblPrEx>
         <w:tc>
           <w:tcPr>
             <w:tcW w:w="2400" w:type="dxa"/>
@@ -3633,6 +1644,7 @@
                 <w:sz w:val="20"/>
                 <w:szCs w:val="20"/>
               </w:rPr>
+              <w:lastRenderedPageBreak/>
               <w:t>1903</w:t>
             </w:r>
           </w:p>
@@ -3711,12 +1723,6 @@
         </w:tc>
       </w:tr>
       <w:tr>
-        <w:tblPrEx>
-          <w:tblCellMar>
-            <w:top w:w="0" w:type="dxa"/>
-            <w:bottom w:w="0" w:type="dxa"/>
-          </w:tblCellMar>
-        </w:tblPrEx>
         <w:tc>
           <w:tcPr>
             <w:tcW w:w="2400" w:type="dxa"/>
@@ -3818,12 +1824,6 @@
         </w:tc>
       </w:tr>
       <w:tr>
-        <w:tblPrEx>
-          <w:tblCellMar>
-            <w:top w:w="0" w:type="dxa"/>
-            <w:bottom w:w="0" w:type="dxa"/>
-          </w:tblCellMar>
-        </w:tblPrEx>
         <w:tc>
           <w:tcPr>
             <w:tcW w:w="2400" w:type="dxa"/>
@@ -3919,7 +1919,16 @@
     <w:p>
       <w:pPr>
         <w:spacing w:before="80"/>
-      </w:pPr>
+        <w:rPr>
+          <w:vertAlign w:val="superscript"/>
+        </w:rPr>
+      </w:pPr>
+      <w:r>
+        <w:rPr>
+          <w:vertAlign w:val="superscript"/>
+        </w:rPr>
+        <w:t>Источник: Большевики Среднего Урала в революции 1905–1907 годов: сборник документов и материалов. Свердловск, 1956. С. 9–12. Доля политических стачек рассчитана автором на основе хронологической росписи, приведённой в сборнике.</w:t>
+      </w:r>
     </w:p>
     <w:p>
       <w:pPr>
@@ -3930,11 +1939,9 @@
       <w:pPr>
         <w:pStyle w:val="2"/>
       </w:pPr>
-      <w:bookmarkStart w:id="8" w:name="_Toc230517444"/>
       <w:r>
         <w:t>2.3. Революционное подполье: что нам реально известно</w:t>
       </w:r>
-      <w:bookmarkEnd w:id="8"/>
     </w:p>
     <w:p>
       <w:pPr>
@@ -3964,21 +1971,17 @@
       <w:pPr>
         <w:pStyle w:val="1"/>
       </w:pPr>
-      <w:bookmarkStart w:id="9" w:name="_Toc230517445"/>
       <w:r>
         <w:t>Раздел 3. Хронология революционных событий</w:t>
       </w:r>
-      <w:bookmarkEnd w:id="9"/>
     </w:p>
     <w:p>
       <w:pPr>
         <w:pStyle w:val="2"/>
       </w:pPr>
-      <w:bookmarkStart w:id="10" w:name="_Toc230517446"/>
       <w:r>
         <w:t>3.1. Весна 1905: первые открытые выступления</w:t>
       </w:r>
-      <w:bookmarkEnd w:id="10"/>
     </w:p>
     <w:p>
       <w:pPr>
@@ -4008,11 +2011,16 @@
       <w:pPr>
         <w:pStyle w:val="2"/>
       </w:pPr>
-      <w:bookmarkStart w:id="11" w:name="_Toc230517447"/>
+      <w:r>
+        <w:rPr>
+          <w:lang w:val="en-US"/>
+        </w:rPr>
+        <w:lastRenderedPageBreak/>
+        <w:br/>
+      </w:r>
       <w:r>
         <w:t>3.2. Май 1905: стачка на Верх-Исетском заводе</w:t>
       </w:r>
-      <w:bookmarkEnd w:id="11"/>
     </w:p>
     <w:p>
       <w:pPr>
@@ -4021,7 +2029,6 @@
         <w:jc w:val="both"/>
       </w:pPr>
       <w:r>
-        <w:lastRenderedPageBreak/>
         <w:t>По данным сборника 1956 года</w:t>
       </w:r>
       <w:r>
@@ -4131,11 +2138,9 @@
       <w:pPr>
         <w:pStyle w:val="2"/>
       </w:pPr>
-      <w:bookmarkStart w:id="12" w:name="_Toc230517448"/>
       <w:r>
         <w:t>3.3. Октябрь 1905: Манифест и его последствия</w:t>
       </w:r>
-      <w:bookmarkEnd w:id="12"/>
     </w:p>
     <w:p>
       <w:pPr>
@@ -4165,11 +2170,9 @@
       <w:pPr>
         <w:pStyle w:val="2"/>
       </w:pPr>
-      <w:bookmarkStart w:id="13" w:name="_Toc230517449"/>
       <w:r>
         <w:t>3.4. Октябрь–ноябрь 1905: «месяц митингов»</w:t>
       </w:r>
-      <w:bookmarkEnd w:id="13"/>
     </w:p>
     <w:p>
       <w:pPr>
@@ -4211,7 +2214,7 @@
           <w:left w:w="10" w:type="dxa"/>
           <w:right w:w="10" w:type="dxa"/>
         </w:tblCellMar>
-        <w:tblLook w:val="04A0" w:firstRow="1" w:lastRow="0" w:firstColumn="1" w:lastColumn="0" w:noHBand="0" w:noVBand="1"/>
+        <w:tblLook w:val="0000" w:firstRow="0" w:lastRow="0" w:firstColumn="0" w:lastColumn="0" w:noHBand="0" w:noVBand="0"/>
       </w:tblPr>
       <w:tblGrid>
         <w:gridCol w:w="2400"/>
@@ -4220,12 +2223,6 @@
         <w:gridCol w:w="2200"/>
       </w:tblGrid>
       <w:tr>
-        <w:tblPrEx>
-          <w:tblCellMar>
-            <w:top w:w="0" w:type="dxa"/>
-            <w:bottom w:w="0" w:type="dxa"/>
-          </w:tblCellMar>
-        </w:tblPrEx>
         <w:trPr>
           <w:tblHeader/>
         </w:trPr>
@@ -4367,12 +2364,6 @@
         </w:tc>
       </w:tr>
       <w:tr>
-        <w:tblPrEx>
-          <w:tblCellMar>
-            <w:top w:w="0" w:type="dxa"/>
-            <w:bottom w:w="0" w:type="dxa"/>
-          </w:tblCellMar>
-        </w:tblPrEx>
         <w:tc>
           <w:tcPr>
             <w:tcW w:w="2400" w:type="dxa"/>
@@ -4499,12 +2490,6 @@
         </w:tc>
       </w:tr>
       <w:tr>
-        <w:tblPrEx>
-          <w:tblCellMar>
-            <w:top w:w="0" w:type="dxa"/>
-            <w:bottom w:w="0" w:type="dxa"/>
-          </w:tblCellMar>
-        </w:tblPrEx>
         <w:tc>
           <w:tcPr>
             <w:tcW w:w="2400" w:type="dxa"/>
@@ -4624,12 +2609,6 @@
         </w:tc>
       </w:tr>
       <w:tr>
-        <w:tblPrEx>
-          <w:tblCellMar>
-            <w:top w:w="0" w:type="dxa"/>
-            <w:bottom w:w="0" w:type="dxa"/>
-          </w:tblCellMar>
-        </w:tblPrEx>
         <w:tc>
           <w:tcPr>
             <w:tcW w:w="2400" w:type="dxa"/>
@@ -4743,6 +2722,34 @@
     <w:p>
       <w:pPr>
         <w:spacing w:before="80"/>
+        <w:rPr>
+          <w:vertAlign w:val="superscript"/>
+        </w:rPr>
+      </w:pPr>
+      <w:r>
+        <w:rPr>
+          <w:vertAlign w:val="superscript"/>
+        </w:rPr>
+        <w:t>Источник</w:t>
+      </w:r>
+      <w:proofErr w:type="gramStart"/>
+      <w:r>
+        <w:rPr>
+          <w:vertAlign w:val="superscript"/>
+        </w:rPr>
+        <w:t>: Там</w:t>
+      </w:r>
+      <w:proofErr w:type="gramEnd"/>
+      <w:r>
+        <w:rPr>
+          <w:vertAlign w:val="superscript"/>
+        </w:rPr>
+        <w:t xml:space="preserve"> же. С. 9, 24–26. Оценочные данные о посещаемости обусловлены отсутствием точных подсчётов в современной автору периодике; приведены по косвенным указаниям сборника.</w:t>
+      </w:r>
+    </w:p>
+    <w:p>
+      <w:pPr>
+        <w:spacing w:before="80"/>
       </w:pPr>
     </w:p>
     <w:p>
@@ -4773,11 +2780,9 @@
       <w:pPr>
         <w:pStyle w:val="2"/>
       </w:pPr>
-      <w:bookmarkStart w:id="14" w:name="_Toc230517450"/>
       <w:r>
         <w:t>3.5. 19 октября 1905: погром на Кафедральной площади</w:t>
       </w:r>
-      <w:bookmarkEnd w:id="14"/>
     </w:p>
     <w:p>
       <w:pPr>
@@ -4835,11 +2840,9 @@
       <w:pPr>
         <w:pStyle w:val="2"/>
       </w:pPr>
-      <w:bookmarkStart w:id="15" w:name="_Toc230517451"/>
       <w:r>
         <w:t>3.6. 16 ноября 1905: создание Совета рабочих депутатов</w:t>
       </w:r>
-      <w:bookmarkEnd w:id="15"/>
     </w:p>
     <w:p>
       <w:pPr>
@@ -4939,11 +2942,9 @@
       <w:pPr>
         <w:pStyle w:val="2"/>
       </w:pPr>
-      <w:bookmarkStart w:id="16" w:name="_Toc230517452"/>
       <w:r>
         <w:t>3.7. Декабрь 1905: разгром</w:t>
       </w:r>
-      <w:bookmarkEnd w:id="16"/>
     </w:p>
     <w:p>
       <w:pPr>
@@ -4961,7 +2962,11 @@
         <w:footnoteReference w:id="16"/>
       </w:r>
       <w:r>
-        <w:t>, последовали аресты основных деятелей Совета и боевых дружин. Свердлов был арестован в январе 1906 года и этапирован в Пермскую тюрьму</w:t>
+        <w:t xml:space="preserve">, последовали аресты основных деятелей Совета и боевых </w:t>
+      </w:r>
+      <w:r>
+        <w:lastRenderedPageBreak/>
+        <w:t>дружин. Свердлов был арестован в январе 1906 года и этапирован в Пермскую тюрьму</w:t>
       </w:r>
       <w:r>
         <w:rPr>
@@ -4982,22 +2987,17 @@
       <w:pPr>
         <w:pStyle w:val="1"/>
       </w:pPr>
-      <w:bookmarkStart w:id="17" w:name="_Toc230517453"/>
-      <w:r>
-        <w:lastRenderedPageBreak/>
+      <w:r>
         <w:t>Раздел 4. Последствия и значение</w:t>
       </w:r>
-      <w:bookmarkEnd w:id="17"/>
     </w:p>
     <w:p>
       <w:pPr>
         <w:pStyle w:val="2"/>
       </w:pPr>
-      <w:bookmarkStart w:id="18" w:name="_Toc230517454"/>
       <w:r>
         <w:t>4.1. Боевые дружины и репрессии</w:t>
       </w:r>
-      <w:bookmarkEnd w:id="18"/>
     </w:p>
     <w:p>
       <w:pPr>
@@ -5035,11 +3035,9 @@
       <w:pPr>
         <w:pStyle w:val="2"/>
       </w:pPr>
-      <w:bookmarkStart w:id="19" w:name="_Toc230517455"/>
       <w:r>
         <w:t>4.2. Роль различных политических сил: постсоветская переоценка</w:t>
       </w:r>
-      <w:bookmarkEnd w:id="19"/>
     </w:p>
     <w:p>
       <w:pPr>
@@ -5083,11 +3081,10 @@
       <w:pPr>
         <w:pStyle w:val="2"/>
       </w:pPr>
-      <w:bookmarkStart w:id="20" w:name="_Toc230517456"/>
-      <w:r>
+      <w:r>
+        <w:lastRenderedPageBreak/>
         <w:t>4.3. Топонимическое наследие</w:t>
       </w:r>
-      <w:bookmarkEnd w:id="20"/>
     </w:p>
     <w:p>
       <w:pPr>
@@ -5109,7 +3106,7 @@
           <w:left w:w="10" w:type="dxa"/>
           <w:right w:w="10" w:type="dxa"/>
         </w:tblCellMar>
-        <w:tblLook w:val="04A0" w:firstRow="1" w:lastRow="0" w:firstColumn="1" w:lastColumn="0" w:noHBand="0" w:noVBand="1"/>
+        <w:tblLook w:val="0000" w:firstRow="0" w:lastRow="0" w:firstColumn="0" w:lastColumn="0" w:noHBand="0" w:noVBand="0"/>
       </w:tblPr>
       <w:tblGrid>
         <w:gridCol w:w="800"/>
@@ -5117,12 +3114,6 @@
         <w:gridCol w:w="3600"/>
       </w:tblGrid>
       <w:tr>
-        <w:tblPrEx>
-          <w:tblCellMar>
-            <w:top w:w="0" w:type="dxa"/>
-            <w:bottom w:w="0" w:type="dxa"/>
-          </w:tblCellMar>
-        </w:tblPrEx>
         <w:trPr>
           <w:tblHeader/>
         </w:trPr>
@@ -5230,12 +3221,6 @@
         </w:tc>
       </w:tr>
       <w:tr>
-        <w:tblPrEx>
-          <w:tblCellMar>
-            <w:top w:w="0" w:type="dxa"/>
-            <w:bottom w:w="0" w:type="dxa"/>
-          </w:tblCellMar>
-        </w:tblPrEx>
         <w:tc>
           <w:tcPr>
             <w:tcW w:w="800" w:type="dxa"/>
@@ -5319,12 +3304,6 @@
         </w:tc>
       </w:tr>
       <w:tr>
-        <w:tblPrEx>
-          <w:tblCellMar>
-            <w:top w:w="0" w:type="dxa"/>
-            <w:bottom w:w="0" w:type="dxa"/>
-          </w:tblCellMar>
-        </w:tblPrEx>
         <w:tc>
           <w:tcPr>
             <w:tcW w:w="800" w:type="dxa"/>
@@ -5408,12 +3387,6 @@
         </w:tc>
       </w:tr>
       <w:tr>
-        <w:tblPrEx>
-          <w:tblCellMar>
-            <w:top w:w="0" w:type="dxa"/>
-            <w:bottom w:w="0" w:type="dxa"/>
-          </w:tblCellMar>
-        </w:tblPrEx>
         <w:tc>
           <w:tcPr>
             <w:tcW w:w="800" w:type="dxa"/>
@@ -5506,11 +3479,9 @@
       <w:pPr>
         <w:pStyle w:val="2"/>
       </w:pPr>
-      <w:bookmarkStart w:id="21" w:name="_Toc230517457"/>
       <w:r>
         <w:t>4.4. Институциональная преемственность: от 1905 к 1917 году</w:t>
       </w:r>
-      <w:bookmarkEnd w:id="21"/>
     </w:p>
     <w:p>
       <w:pPr>
@@ -5556,21 +3527,17 @@
       <w:pPr>
         <w:pStyle w:val="1"/>
       </w:pPr>
-      <w:bookmarkStart w:id="22" w:name="_Toc230517458"/>
       <w:r>
         <w:t>Раздел 5. Историографический анализ</w:t>
       </w:r>
-      <w:bookmarkEnd w:id="22"/>
     </w:p>
     <w:p>
       <w:pPr>
         <w:pStyle w:val="2"/>
       </w:pPr>
-      <w:bookmarkStart w:id="23" w:name="_Toc230517459"/>
       <w:r>
         <w:t>5.1. Советская историография (1920–1980-е гг.)</w:t>
       </w:r>
-      <w:bookmarkEnd w:id="23"/>
     </w:p>
     <w:p>
       <w:pPr>
@@ -5579,7 +3546,11 @@
         <w:jc w:val="both"/>
       </w:pPr>
       <w:r>
-        <w:t>В советский период события 1905–1907 годов изучались преимущественно в рамках ленинской концепции «генеральной репетиции». Базовым документальным сводом по уральскому региону стал сборник «Большевики Среднего Урала» (1956)</w:t>
+        <w:t xml:space="preserve">В советский период события 1905–1907 годов изучались преимущественно в рамках ленинской концепции «генеральной репетиции». Базовым документальным </w:t>
+      </w:r>
+      <w:r>
+        <w:lastRenderedPageBreak/>
+        <w:t>сводом по уральскому региону стал сборник «Большевики Среднего Урала» (1956)</w:t>
       </w:r>
       <w:r>
         <w:rPr>
@@ -5600,11 +3571,9 @@
       <w:pPr>
         <w:pStyle w:val="2"/>
       </w:pPr>
-      <w:bookmarkStart w:id="24" w:name="_Toc230517460"/>
       <w:r>
         <w:t>5.2. Постсоветская историография (с 1991 г.)</w:t>
       </w:r>
-      <w:bookmarkEnd w:id="24"/>
     </w:p>
     <w:p>
       <w:pPr>
@@ -5613,7 +3582,6 @@
         <w:jc w:val="both"/>
       </w:pPr>
       <w:r>
-        <w:lastRenderedPageBreak/>
         <w:t>Монография А.В. Чернова</w:t>
       </w:r>
       <w:r>
@@ -5659,11 +3627,9 @@
       <w:pPr>
         <w:pStyle w:val="2"/>
       </w:pPr>
-      <w:bookmarkStart w:id="25" w:name="_Toc230517461"/>
       <w:r>
         <w:t>5.3. «Генеральная репетиция»: метафора или верифицируемый вывод?</w:t>
       </w:r>
-      <w:bookmarkEnd w:id="25"/>
     </w:p>
     <w:p>
       <w:pPr>
@@ -5672,7 +3638,11 @@
         <w:jc w:val="both"/>
       </w:pPr>
       <w:r>
-        <w:t>Ленинская метафора «генеральной репетиции», традиционно воспринимавшаяся как идеологическая фигура, при ближайшем рассмотрении оказывается верифицируемым историческим выводом. Революция 1905 года в Екатеринбурге отработала все ключевые институты, воспроизведённые в 1917-м: Совет, боевые дружины, заводские комитеты, массовые митинги как инструмент политической мобилизации. Об этой институциональной логике убедительно пишет В.Л. Харитонов</w:t>
+        <w:t xml:space="preserve">Ленинская метафора «генеральной репетиции», традиционно воспринимавшаяся как идеологическая фигура, при ближайшем рассмотрении оказывается верифицируемым историческим выводом. Революция 1905 года в Екатеринбурге отработала все ключевые </w:t>
+      </w:r>
+      <w:r>
+        <w:lastRenderedPageBreak/>
+        <w:t>институты, воспроизведённые в 1917-м: Совет, боевые дружины, заводские комитеты, массовые митинги как инструмент политической мобилизации. Об этой институциональной логике убедительно пишет В.Л. Харитонов</w:t>
       </w:r>
       <w:r>
         <w:rPr>
@@ -5693,11 +3663,9 @@
       <w:pPr>
         <w:pStyle w:val="1"/>
       </w:pPr>
-      <w:bookmarkStart w:id="26" w:name="_Toc230517462"/>
       <w:r>
         <w:t>Выводы</w:t>
       </w:r>
-      <w:bookmarkEnd w:id="26"/>
     </w:p>
     <w:p>
       <w:pPr>
@@ -5714,11 +3682,7 @@
       </w:r>
       <w:proofErr w:type="spellEnd"/>
       <w:r>
-        <w:t xml:space="preserve"> (7–14 мая), массовые митинги с аудиторией до 700 </w:t>
-      </w:r>
-      <w:r>
-        <w:lastRenderedPageBreak/>
-        <w:t>человек (октябрь–ноябрь), погром с двумя жертвами (19 октября), создание Совета из 32 депутатов (16 ноября) — до разгрома и арестов (декабрь 1905 — январь 1906).</w:t>
+        <w:t xml:space="preserve"> (7–14 мая), массовые митинги с аудиторией до 700 человек (октябрь–ноябрь), погром с двумя жертвами (19 октября), создание Совета из 32 депутатов (16 ноября) — до разгрома и арестов (декабрь 1905 — январь 1906).</w:t>
       </w:r>
     </w:p>
     <w:p>
@@ -5800,21 +3764,18 @@
       <w:pPr>
         <w:pStyle w:val="1"/>
       </w:pPr>
-      <w:bookmarkStart w:id="27" w:name="_Toc230517463"/>
-      <w:r>
+      <w:r>
+        <w:lastRenderedPageBreak/>
         <w:t>Список источников и литературы</w:t>
       </w:r>
-      <w:bookmarkEnd w:id="27"/>
     </w:p>
     <w:p>
       <w:pPr>
         <w:pStyle w:val="2"/>
       </w:pPr>
-      <w:bookmarkStart w:id="28" w:name="_Toc230517464"/>
       <w:r>
         <w:t>I. Документальные сборники</w:t>
       </w:r>
-      <w:bookmarkEnd w:id="28"/>
     </w:p>
     <w:p>
       <w:pPr>
@@ -5995,7 +3956,6 @@
           <w:sz w:val="20"/>
           <w:szCs w:val="20"/>
         </w:rPr>
-        <w:lastRenderedPageBreak/>
         <w:t>→ Официальное статистическое издание. Использован для данных о числе рабочих и объёме производства крупнейших предприятий Екатеринбурга. Частично оцифрован: отдел редкой книги РНБ (Российская национальная библиотека).</w:t>
       </w:r>
     </w:p>
@@ -6008,11 +3968,9 @@
       <w:pPr>
         <w:pStyle w:val="2"/>
       </w:pPr>
-      <w:bookmarkStart w:id="29" w:name="_Toc230517465"/>
       <w:r>
         <w:t>II. Монографии</w:t>
       </w:r>
-      <w:bookmarkEnd w:id="29"/>
     </w:p>
     <w:p>
       <w:pPr>
@@ -6156,8 +4114,19 @@
           <w:sz w:val="22"/>
           <w:szCs w:val="22"/>
         </w:rPr>
-        <w:t>Лаверычев В.Я.</w:t>
-      </w:r>
+        <w:t xml:space="preserve">Лаверычев </w:t>
+      </w:r>
+      <w:proofErr w:type="gramStart"/>
+      <w:r>
+        <w:rPr>
+          <w:b/>
+          <w:bCs/>
+          <w:sz w:val="22"/>
+          <w:szCs w:val="22"/>
+        </w:rPr>
+        <w:t>В.Я.</w:t>
+      </w:r>
+      <w:proofErr w:type="gramEnd"/>
       <w:r>
         <w:rPr>
           <w:sz w:val="22"/>
@@ -6259,9 +4228,8 @@
           <w:sz w:val="20"/>
           <w:szCs w:val="20"/>
         </w:rPr>
-        <w:t xml:space="preserve">→ Первая постсоветская монография, системно рассматривающая революционное движение на Урале на основе ранее закрытых архивных фондов (ГАСО, ЦДООСО). Ключевой вклад: данные о численности и деятельности эсеровских боевых дружин, сопоставимых по масштабу с большевистскими. Экземпляр в библиотеке ИИА </w:t>
-      </w:r>
-      <w:proofErr w:type="spellStart"/>
+        <w:t xml:space="preserve">→ Первая постсоветская монография, системно рассматривающая революционное движение на Урале на основе ранее закрытых архивных фондов (ГАСО, ЦДООСО). Ключевой вклад: данные о </w:t>
+      </w:r>
       <w:r>
         <w:rPr>
           <w:i/>
@@ -6270,9 +4238,10 @@
           <w:sz w:val="20"/>
           <w:szCs w:val="20"/>
         </w:rPr>
-        <w:t>УрО</w:t>
-      </w:r>
-      <w:proofErr w:type="spellEnd"/>
+        <w:lastRenderedPageBreak/>
+        <w:t xml:space="preserve">численности и деятельности эсеровских боевых дружин, сопоставимых по масштабу с большевистскими. Экземпляр в библиотеке ИИА </w:t>
+      </w:r>
+      <w:proofErr w:type="spellStart"/>
       <w:r>
         <w:rPr>
           <w:i/>
@@ -6281,6 +4250,17 @@
           <w:sz w:val="20"/>
           <w:szCs w:val="20"/>
         </w:rPr>
+        <w:t>УрО</w:t>
+      </w:r>
+      <w:proofErr w:type="spellEnd"/>
+      <w:r>
+        <w:rPr>
+          <w:i/>
+          <w:iCs/>
+          <w:color w:val="888888"/>
+          <w:sz w:val="20"/>
+          <w:szCs w:val="20"/>
+        </w:rPr>
         <w:t xml:space="preserve"> РАН, Екатеринбург.</w:t>
       </w:r>
     </w:p>
@@ -6293,11 +4273,9 @@
       <w:pPr>
         <w:pStyle w:val="2"/>
       </w:pPr>
-      <w:bookmarkStart w:id="30" w:name="_Toc230517466"/>
       <w:r>
         <w:t>III. Научные статьи</w:t>
       </w:r>
-      <w:bookmarkEnd w:id="30"/>
     </w:p>
     <w:p>
       <w:pPr>
@@ -6513,7 +4491,7 @@
         <w:sz w:val="18"/>
         <w:szCs w:val="18"/>
       </w:rPr>
-      <w:t>13</w:t>
+      <w:t>1</w:t>
     </w:r>
     <w:r>
       <w:rPr>
@@ -6633,27 +4611,51 @@
     <w:p>
       <w:pPr>
         <w:spacing w:after="60" w:line="280" w:lineRule="auto"/>
+        <w:rPr>
+          <w:sz w:val="22"/>
+          <w:szCs w:val="22"/>
+        </w:rPr>
       </w:pPr>
       <w:r>
         <w:rPr>
           <w:rStyle w:val="a6"/>
+          <w:sz w:val="22"/>
+          <w:szCs w:val="22"/>
         </w:rPr>
         <w:footnoteRef/>
       </w:r>
       <w:r>
         <w:rPr>
           <w:color w:val="555555"/>
-          <w:sz w:val="20"/>
-          <w:szCs w:val="20"/>
-        </w:rPr>
-        <w:t>Лаверычев В.Я. По ту сторону баррикад</w:t>
+          <w:sz w:val="18"/>
+          <w:szCs w:val="18"/>
+        </w:rPr>
+        <w:t xml:space="preserve">Лаверычев </w:t>
       </w:r>
       <w:proofErr w:type="gramStart"/>
       <w:r>
         <w:rPr>
           <w:color w:val="555555"/>
-          <w:sz w:val="20"/>
-          <w:szCs w:val="20"/>
+          <w:sz w:val="18"/>
+          <w:szCs w:val="18"/>
+        </w:rPr>
+        <w:t>В.Я.</w:t>
+      </w:r>
+      <w:proofErr w:type="gramEnd"/>
+      <w:r>
+        <w:rPr>
+          <w:color w:val="555555"/>
+          <w:sz w:val="18"/>
+          <w:szCs w:val="18"/>
+        </w:rPr>
+        <w:t xml:space="preserve"> По ту сторону баррикад</w:t>
+      </w:r>
+      <w:proofErr w:type="gramStart"/>
+      <w:r>
+        <w:rPr>
+          <w:color w:val="555555"/>
+          <w:sz w:val="18"/>
+          <w:szCs w:val="18"/>
         </w:rPr>
         <w:t>: Из</w:t>
       </w:r>
@@ -6661,8 +4663,8 @@
       <w:r>
         <w:rPr>
           <w:color w:val="555555"/>
-          <w:sz w:val="20"/>
-          <w:szCs w:val="20"/>
+          <w:sz w:val="18"/>
+          <w:szCs w:val="18"/>
         </w:rPr>
         <w:t xml:space="preserve"> истории борьбы московской буржуазии с революцией. М.: Мысль, 1967. С. 22–25. — Анализ реакции предпринимательских кругов на рабочие выступления; данные о численности бастующих в масштабах страны.</w:t>
       </w:r>
@@ -6672,37 +4674,143 @@
     <w:p>
       <w:pPr>
         <w:spacing w:after="60" w:line="280" w:lineRule="auto"/>
+        <w:rPr>
+          <w:color w:val="555555"/>
+          <w:sz w:val="18"/>
+          <w:szCs w:val="18"/>
+        </w:rPr>
       </w:pPr>
       <w:r>
         <w:rPr>
           <w:rStyle w:val="a6"/>
+          <w:sz w:val="22"/>
+          <w:szCs w:val="22"/>
         </w:rPr>
         <w:footnoteRef/>
       </w:r>
       <w:r>
         <w:rPr>
           <w:color w:val="555555"/>
-          <w:sz w:val="20"/>
-          <w:szCs w:val="20"/>
+          <w:sz w:val="18"/>
+          <w:szCs w:val="18"/>
         </w:rPr>
         <w:t>Обзор Пермской губернии за 1904 год / Пермский губернский статистический комитет. Пермь, 1905. С. 42–48. — Официальное статистическое издание; таблицы фабрично-заводских предприятий по уездам с числом рабочих и объёмом производства. Оцифрован частично: РНБ (Российская национальная библиотека), отдел редкой книги.</w:t>
+      </w:r>
+    </w:p>
+    <w:p>
+      <w:pPr>
+        <w:spacing w:after="60" w:line="280" w:lineRule="auto"/>
+        <w:rPr>
+          <w:sz w:val="18"/>
+          <w:szCs w:val="18"/>
+        </w:rPr>
+      </w:pPr>
+      <w:r>
+        <w:rPr>
+          <w:sz w:val="18"/>
+          <w:szCs w:val="18"/>
+        </w:rPr>
+        <w:t xml:space="preserve">⁵ Рабочее движение на Урале в годы Первой русской революции: документы и материалы. Свердловск: </w:t>
+      </w:r>
+      <w:proofErr w:type="spellStart"/>
+      <w:r>
+        <w:rPr>
+          <w:sz w:val="18"/>
+          <w:szCs w:val="18"/>
+        </w:rPr>
+        <w:t>УрО</w:t>
+      </w:r>
+      <w:proofErr w:type="spellEnd"/>
+      <w:r>
+        <w:rPr>
+          <w:sz w:val="18"/>
+          <w:szCs w:val="18"/>
+        </w:rPr>
+        <w:t xml:space="preserve"> АН СССР, 1981. С. 45–48. — Косвенные данные о числе рабочих дней на горнозаводских предприятиях (240–260 дней в год с учётом «гулевых дней»); расчётное значение, использованное автором для оценки годового заработка.</w:t>
       </w:r>
     </w:p>
   </w:footnote>
   <w:footnote w:id="5">
-    <w:p/>
-    <w:p/>
+    <w:p>
+      <w:pPr>
+        <w:rPr>
+          <w:sz w:val="14"/>
+          <w:szCs w:val="14"/>
+        </w:rPr>
+      </w:pPr>
+    </w:p>
+    <w:p>
+      <w:r>
+        <w:rPr>
+          <w:sz w:val="20"/>
+          <w:szCs w:val="20"/>
+        </w:rPr>
+        <w:t>⁶ Большевики Среднего Урала в революции 1905–1907 годов: сборник документов и материалов. Свердловск: Средне-Уральское книжное изд-во, 1956. С. 9–12. — Хроника стачечного движения по Пермской губернии за 1900–1904 гг.; доля политических стачек рассчитана автором на основе хронологической росписи, приведённой в сборнике.</w:t>
+      </w:r>
+    </w:p>
   </w:footnote>
   <w:footnote w:id="6">
     <w:p/>
     <w:p/>
   </w:footnote>
   <w:footnote w:id="7">
-    <w:p/>
-    <w:p/>
+    <w:p>
+      <w:pPr>
+        <w:rPr>
+          <w:sz w:val="20"/>
+          <w:szCs w:val="20"/>
+          <w:lang w:val="en-US"/>
+        </w:rPr>
+      </w:pPr>
+      <w:r>
+        <w:rPr>
+          <w:sz w:val="20"/>
+          <w:szCs w:val="20"/>
+        </w:rPr>
+        <w:t>⁷ Большевики Среднего Урала в революции 1905–1907 годов: сборник документов и материалов. Свердловск: Средне-Уральское книжное изд-во, 1956. С. 24–26. — Опубликованные тексты прокламаций Екатеринбургского комитета РСДРП за 1903–1904 гг.; составитель сборника указывает, что оригиналы хранятся в партийном архиве (</w:t>
+      </w:r>
+      <w:proofErr w:type="spellStart"/>
+      <w:r>
+        <w:rPr>
+          <w:sz w:val="20"/>
+          <w:szCs w:val="20"/>
+        </w:rPr>
+        <w:t>Истпарт</w:t>
+      </w:r>
+      <w:proofErr w:type="spellEnd"/>
+      <w:r>
+        <w:rPr>
+          <w:sz w:val="20"/>
+          <w:szCs w:val="20"/>
+        </w:rPr>
+        <w:t>), ныне — часть фондов ЦДООСО. Цитирование даётся по опубликованному тексту сборника.</w:t>
+      </w:r>
+    </w:p>
+    <w:p>
+      <w:pPr>
+        <w:rPr>
+          <w:sz w:val="20"/>
+          <w:szCs w:val="20"/>
+        </w:rPr>
+      </w:pPr>
+    </w:p>
   </w:footnote>
   <w:footnote w:id="8">
-    <w:p/>
+    <w:p>
+      <w:pPr>
+        <w:rPr>
+          <w:sz w:val="20"/>
+          <w:szCs w:val="20"/>
+        </w:rPr>
+      </w:pPr>
+      <w:r>
+        <w:rPr>
+          <w:sz w:val="20"/>
+          <w:szCs w:val="20"/>
+        </w:rPr>
+        <w:t>⁸ Большевики Среднего Урала в революции 1905–1907 годов: сборник документов и материалов. Свердловск: Средне-Уральское книжное изд-во, 1956. С. 14–16. — Описание первомайской демонстрации 1905 г. в Екатеринбурге: маршрут, численность участников (несколько десятков человек), действия полиции. Данные приведены по опубликованному тексту сборника.</w:t>
+      </w:r>
+    </w:p>
     <w:p/>
   </w:footnote>
   <w:footnote w:id="9">
@@ -6768,7 +4876,21 @@
     </w:p>
   </w:footnote>
   <w:footnote w:id="11">
-    <w:p/>
+    <w:p>
+      <w:pPr>
+        <w:rPr>
+          <w:sz w:val="20"/>
+          <w:szCs w:val="20"/>
+        </w:rPr>
+      </w:pPr>
+      <w:r>
+        <w:rPr>
+          <w:sz w:val="20"/>
+          <w:szCs w:val="20"/>
+        </w:rPr>
+        <w:t>¹¹ Большевики Среднего Урала… С. 9, 24–26. — Оценочные данные о посещаемости митингов в Екатеринбурге в период «месяца митингов» (октябрь–ноябрь 1905 г.); точные подсчёты в источнике отсутствуют, приведены по косвенным указаниям сборника.</w:t>
+      </w:r>
+    </w:p>
     <w:p/>
   </w:footnote>
   <w:footnote w:id="12">
@@ -6893,10 +5015,70 @@
   </w:footnote>
   <w:footnote w:id="16">
     <w:p/>
-    <w:p/>
+    <w:p>
+      <w:pPr>
+        <w:rPr>
+          <w:sz w:val="20"/>
+          <w:szCs w:val="20"/>
+        </w:rPr>
+      </w:pPr>
+      <w:r>
+        <w:rPr>
+          <w:sz w:val="20"/>
+          <w:szCs w:val="20"/>
+        </w:rPr>
+        <w:t>¹⁶ Большевики Среднего Урала… С. 42–45. — Хроника арестов основных деятелей Екатеринбургского Совета и боевых дружин после введения чрезвычайного положения 28 декабря 1905 г.; данные приведены по опубликованному тексту сборника.</w:t>
+      </w:r>
+    </w:p>
   </w:footnote>
   <w:footnote w:id="17">
-    <w:p/>
+    <w:p>
+      <w:pPr>
+        <w:rPr>
+          <w:sz w:val="20"/>
+          <w:szCs w:val="20"/>
+        </w:rPr>
+      </w:pPr>
+      <w:r>
+        <w:rPr>
+          <w:sz w:val="20"/>
+          <w:szCs w:val="20"/>
+        </w:rPr>
+        <w:t xml:space="preserve">¹⁷ Городецкий </w:t>
+      </w:r>
+      <w:proofErr w:type="gramStart"/>
+      <w:r>
+        <w:rPr>
+          <w:sz w:val="20"/>
+          <w:szCs w:val="20"/>
+        </w:rPr>
+        <w:t>Е.Н.</w:t>
+      </w:r>
+      <w:proofErr w:type="gramEnd"/>
+      <w:r>
+        <w:rPr>
+          <w:sz w:val="20"/>
+          <w:szCs w:val="20"/>
+        </w:rPr>
+        <w:t xml:space="preserve"> Свердлов: жизнь и деятельность. М.: Политиздат, 1971. С. 45–47. — Обстоятельства ареста </w:t>
+      </w:r>
+      <w:proofErr w:type="gramStart"/>
+      <w:r>
+        <w:rPr>
+          <w:sz w:val="20"/>
+          <w:szCs w:val="20"/>
+        </w:rPr>
+        <w:t>Я.М.</w:t>
+      </w:r>
+      <w:proofErr w:type="gramEnd"/>
+      <w:r>
+        <w:rPr>
+          <w:sz w:val="20"/>
+          <w:szCs w:val="20"/>
+        </w:rPr>
+        <w:t xml:space="preserve"> Свердлова в январе 1906 г. и этапирования в Пермскую тюрьму; биографические данные приведены по опубликованному тексту монографии.</w:t>
+      </w:r>
+    </w:p>
     <w:p/>
   </w:footnote>
   <w:footnote w:id="18">
@@ -6939,7 +5121,50 @@
     </w:p>
   </w:footnote>
   <w:footnote w:id="19">
-    <w:p/>
+    <w:p>
+      <w:r>
+        <w:t xml:space="preserve">¹⁹ </w:t>
+      </w:r>
+      <w:r>
+        <w:rPr>
+          <w:sz w:val="20"/>
+          <w:szCs w:val="20"/>
+        </w:rPr>
+        <w:t xml:space="preserve">Чернов </w:t>
+      </w:r>
+      <w:proofErr w:type="gramStart"/>
+      <w:r>
+        <w:rPr>
+          <w:sz w:val="20"/>
+          <w:szCs w:val="20"/>
+        </w:rPr>
+        <w:t>А.В.</w:t>
+      </w:r>
+      <w:proofErr w:type="gramEnd"/>
+      <w:r>
+        <w:rPr>
+          <w:sz w:val="20"/>
+          <w:szCs w:val="20"/>
+        </w:rPr>
+        <w:t xml:space="preserve"> Революционное подполье горнозаводского Урала (1900–1907). Екатеринбург: ИИА </w:t>
+      </w:r>
+      <w:proofErr w:type="spellStart"/>
+      <w:r>
+        <w:rPr>
+          <w:sz w:val="20"/>
+          <w:szCs w:val="20"/>
+        </w:rPr>
+        <w:t>УрО</w:t>
+      </w:r>
+      <w:proofErr w:type="spellEnd"/>
+      <w:r>
+        <w:rPr>
+          <w:sz w:val="20"/>
+          <w:szCs w:val="20"/>
+        </w:rPr>
+        <w:t xml:space="preserve"> РАН, 2005. С. 68–71. — Данные о численности эсеровских дружин приведены по опубликованному тексту монографии; архивные основания этих данных (фонды ГАСО, ЦДООСО) цитируются опосредованно.</w:t>
+      </w:r>
+    </w:p>
     <w:p/>
   </w:footnote>
   <w:footnote w:id="20">
@@ -7013,23 +5238,246 @@
     </w:p>
   </w:footnote>
   <w:footnote w:id="22">
-    <w:p/>
-    <w:p/>
+    <w:p>
+      <w:pPr>
+        <w:rPr>
+          <w:sz w:val="20"/>
+          <w:szCs w:val="20"/>
+        </w:rPr>
+      </w:pPr>
+      <w:r>
+        <w:rPr>
+          <w:sz w:val="20"/>
+          <w:szCs w:val="20"/>
+        </w:rPr>
+        <w:t xml:space="preserve">²² Городецкий </w:t>
+      </w:r>
+      <w:proofErr w:type="gramStart"/>
+      <w:r>
+        <w:rPr>
+          <w:sz w:val="20"/>
+          <w:szCs w:val="20"/>
+        </w:rPr>
+        <w:t>Е.Н.</w:t>
+      </w:r>
+      <w:proofErr w:type="gramEnd"/>
+      <w:r>
+        <w:rPr>
+          <w:sz w:val="20"/>
+          <w:szCs w:val="20"/>
+        </w:rPr>
+        <w:t xml:space="preserve"> Свердлов: жизнь и деятельность. М.: Политиздат, 1971. С. 89–112. — Сведения о деятельности </w:t>
+      </w:r>
+      <w:proofErr w:type="gramStart"/>
+      <w:r>
+        <w:rPr>
+          <w:sz w:val="20"/>
+          <w:szCs w:val="20"/>
+        </w:rPr>
+        <w:t>Я.М.</w:t>
+      </w:r>
+      <w:proofErr w:type="gramEnd"/>
+      <w:r>
+        <w:rPr>
+          <w:sz w:val="20"/>
+          <w:szCs w:val="20"/>
+        </w:rPr>
+        <w:t xml:space="preserve"> Свердлова в 1917–1919 гг. на посту председателя ВЦИК; биографические данные приведены по опубликованному тексту монографии.</w:t>
+      </w:r>
+    </w:p>
+    <w:p>
+      <w:r>
+        <w:rPr>
+          <w:sz w:val="20"/>
+          <w:szCs w:val="20"/>
+        </w:rPr>
+        <w:t>²³ Большевики Среднего Урала в революции 1905–1907 годов: сборник документов и материалов. Свердловск: Средне-Уральское книжное изд-во, 1956. 342 с. — Базовый документальный свод советского периода; ценность — богатая источниковая база (прокламации, хроники, протоколы), ограничение — апологетическая подача роли большевиков. Использован как основной источник по хронологии событий.</w:t>
+      </w:r>
+    </w:p>
   </w:footnote>
   <w:footnote w:id="23">
     <w:p/>
-    <w:p/>
+    <w:p>
+      <w:r>
+        <w:rPr>
+          <w:sz w:val="20"/>
+          <w:szCs w:val="20"/>
+        </w:rPr>
+        <w:t xml:space="preserve">²⁴ Чернов </w:t>
+      </w:r>
+      <w:proofErr w:type="gramStart"/>
+      <w:r>
+        <w:rPr>
+          <w:sz w:val="20"/>
+          <w:szCs w:val="20"/>
+        </w:rPr>
+        <w:t>А.В.</w:t>
+      </w:r>
+      <w:proofErr w:type="gramEnd"/>
+      <w:r>
+        <w:rPr>
+          <w:sz w:val="20"/>
+          <w:szCs w:val="20"/>
+        </w:rPr>
+        <w:t xml:space="preserve"> Революционное подполье горнозаводского Урала (1900–1907). Екатеринбург: ИИА </w:t>
+      </w:r>
+      <w:proofErr w:type="spellStart"/>
+      <w:r>
+        <w:rPr>
+          <w:sz w:val="20"/>
+          <w:szCs w:val="20"/>
+        </w:rPr>
+        <w:t>УрО</w:t>
+      </w:r>
+      <w:proofErr w:type="spellEnd"/>
+      <w:r>
+        <w:rPr>
+          <w:sz w:val="20"/>
+          <w:szCs w:val="20"/>
+        </w:rPr>
+        <w:t xml:space="preserve"> РАН, 2005. — Первая постсоветская монография, системно рассматривающая революционное движение на Урале; ключевой вклад — данные о роли эсеровских организаций. Архивные материалы (ГАСО, ЦДООСО) цитируются опосредованно, через данную публикацию.</w:t>
+      </w:r>
+    </w:p>
   </w:footnote>
   <w:footnote w:id="24">
-    <w:p/>
-    <w:p/>
+    <w:p>
+      <w:pPr>
+        <w:rPr>
+          <w:sz w:val="20"/>
+          <w:szCs w:val="20"/>
+        </w:rPr>
+      </w:pPr>
+      <w:r>
+        <w:rPr>
+          <w:sz w:val="20"/>
+          <w:szCs w:val="20"/>
+        </w:rPr>
+        <w:t xml:space="preserve">²⁵ </w:t>
+      </w:r>
+      <w:proofErr w:type="spellStart"/>
+      <w:r>
+        <w:rPr>
+          <w:sz w:val="20"/>
+          <w:szCs w:val="20"/>
+        </w:rPr>
+        <w:t>Микитюк</w:t>
+      </w:r>
+      <w:proofErr w:type="spellEnd"/>
+      <w:r>
+        <w:rPr>
+          <w:sz w:val="20"/>
+          <w:szCs w:val="20"/>
+        </w:rPr>
+        <w:t xml:space="preserve"> В.П. Уральская буржуазия в период Первой русской революции // Уральский исторический вестник. 2010. № 3 (28). С. 44–52. — Статья в рецензируемом журнале; доступна онлайн: </w:t>
+      </w:r>
+      <w:proofErr w:type="spellStart"/>
+      <w:r>
+        <w:rPr>
+          <w:sz w:val="20"/>
+          <w:szCs w:val="20"/>
+        </w:rPr>
+        <w:t>КиберЛенинка</w:t>
+      </w:r>
+      <w:proofErr w:type="spellEnd"/>
+      <w:r>
+        <w:rPr>
+          <w:sz w:val="20"/>
+          <w:szCs w:val="20"/>
+        </w:rPr>
+        <w:t xml:space="preserve"> (cyberleninka.ru). Восполняет пробел советской историографии в части роли торгово-промышленной элиты Екатеринбурга.</w:t>
+      </w:r>
+    </w:p>
+    <w:p>
+      <w:pPr>
+        <w:rPr>
+          <w:sz w:val="20"/>
+          <w:szCs w:val="20"/>
+        </w:rPr>
+      </w:pPr>
+      <w:r>
+        <w:rPr>
+          <w:sz w:val="20"/>
+          <w:szCs w:val="20"/>
+        </w:rPr>
+        <w:t xml:space="preserve">²⁵ </w:t>
+      </w:r>
+      <w:proofErr w:type="spellStart"/>
+      <w:r>
+        <w:rPr>
+          <w:sz w:val="20"/>
+          <w:szCs w:val="20"/>
+        </w:rPr>
+        <w:t>Микитюк</w:t>
+      </w:r>
+      <w:proofErr w:type="spellEnd"/>
+      <w:r>
+        <w:rPr>
+          <w:sz w:val="20"/>
+          <w:szCs w:val="20"/>
+        </w:rPr>
+        <w:t xml:space="preserve"> В.П. Уральская буржуазия в период Первой русской революции // Уральский исторический вестник. 2010. № 3 (28). С. 44–52. — Статья в рецензируемом журнале; доступна онлайн: </w:t>
+      </w:r>
+      <w:proofErr w:type="spellStart"/>
+      <w:r>
+        <w:rPr>
+          <w:sz w:val="20"/>
+          <w:szCs w:val="20"/>
+        </w:rPr>
+        <w:t>КиберЛенинка</w:t>
+      </w:r>
+      <w:proofErr w:type="spellEnd"/>
+      <w:r>
+        <w:rPr>
+          <w:sz w:val="20"/>
+          <w:szCs w:val="20"/>
+        </w:rPr>
+        <w:t xml:space="preserve"> (cyberleninka.ru). Восполняет пробел советской историографии в части роли торгово-промышленной элиты Екатеринбурга.</w:t>
+      </w:r>
+    </w:p>
   </w:footnote>
   <w:footnote w:id="25">
-    <w:p/>
+    <w:p>
+      <w:pPr>
+        <w:rPr>
+          <w:sz w:val="20"/>
+          <w:szCs w:val="20"/>
+        </w:rPr>
+      </w:pPr>
+    </w:p>
     <w:p/>
   </w:footnote>
   <w:footnote w:id="26">
-    <w:p/>
+    <w:p>
+      <w:pPr>
+        <w:rPr>
+          <w:sz w:val="20"/>
+          <w:szCs w:val="20"/>
+        </w:rPr>
+      </w:pPr>
+      <w:r>
+        <w:rPr>
+          <w:sz w:val="20"/>
+          <w:szCs w:val="20"/>
+        </w:rPr>
+        <w:t xml:space="preserve">²⁶ Харитонов </w:t>
+      </w:r>
+      <w:proofErr w:type="gramStart"/>
+      <w:r>
+        <w:rPr>
+          <w:sz w:val="20"/>
+          <w:szCs w:val="20"/>
+        </w:rPr>
+        <w:t>В.Л.</w:t>
+      </w:r>
+      <w:proofErr w:type="gramEnd"/>
+      <w:r>
+        <w:rPr>
+          <w:sz w:val="20"/>
+          <w:szCs w:val="20"/>
+        </w:rPr>
+        <w:t xml:space="preserve"> Февральская революция в России (попытка многомерного подхода) // Вопросы истории. 1993. № 11–12. С. 18–27. — Статья об институциональной преемственности советских органов от 1905 к 1917 году; сравнительный анализ Советов. Использована для обоснования тезиса о «генеральной репетиции». Доступна через НЭБ.</w:t>
+      </w:r>
+    </w:p>
     <w:p/>
   </w:footnote>
 </w:footnotes>
@@ -7061,96 +5509,10 @@
 <file path=word/numbering.xml><?xml version="1.0" encoding="utf-8"?>
 <w:numbering xmlns:wpc="http://schemas.microsoft.com/office/word/2010/wordprocessingCanvas" xmlns:cx="http://schemas.microsoft.com/office/drawing/2014/chartex" xmlns:cx1="http://schemas.microsoft.com/office/drawing/2015/9/8/chartex" xmlns:cx2="http://schemas.microsoft.com/office/drawing/2015/10/21/chartex" xmlns:cx3="http://schemas.microsoft.com/office/drawing/2016/5/9/chartex" xmlns:cx4="http://schemas.microsoft.com/office/drawing/2016/5/10/chartex" xmlns:cx5="http://schemas.microsoft.com/office/drawing/2016/5/11/chartex" xmlns:cx6="http://schemas.microsoft.com/office/drawing/2016/5/12/chartex" xmlns:cx7="http://schemas.microsoft.com/office/drawing/2016/5/13/chartex" xmlns:cx8="http://schemas.microsoft.com/office/drawing/2016/5/14/chartex" xmlns:mc="http://schemas.openxmlformats.org/markup-compatibility/2006" xmlns:aink="http://schemas.microsoft.com/office/drawing/2016/ink" xmlns:am3d="http://schemas.microsoft.com/office/drawing/2017/model3d" xmlns:o="urn:schemas-microsoft-com:office:office" xmlns:oel="http://schemas.microsoft.com/office/2019/extlst" xmlns:r="http://schemas.openxmlformats.org/officeDocument/2006/relationships" xmlns:m="http://schemas.openxmlformats.org/officeDocument/2006/math" xmlns:v="urn:schemas-microsoft-com:vml" xmlns:wp14="http://schemas.microsoft.com/office/word/2010/wordprocessingDrawing" xmlns:wp="http://schemas.openxmlformats.org/drawingml/2006/wordprocessingDrawing" xmlns:w10="urn:schemas-microsoft-com:office:word" xmlns:w="http://schemas.openxmlformats.org/wordprocessingml/2006/main" xmlns:w14="http://schemas.microsoft.com/office/word/2010/wordml" xmlns:w15="http://schemas.microsoft.com/office/word/2012/wordml" xmlns:w16cex="http://schemas.microsoft.com/office/word/2018/wordml/cex" xmlns:w16cid="http://schemas.microsoft.com/office/word/2016/wordml/cid" xmlns:w16="http://schemas.microsoft.com/office/word/2018/wordml" xmlns:w16du="http://schemas.microsoft.com/office/word/2023/wordml/word16du" xmlns:w16sdtdh="http://schemas.microsoft.com/office/word/2020/wordml/sdtdatahash" xmlns:w16sdtfl="http://schemas.microsoft.com/office/word/2024/wordml/sdtformatlock" xmlns:w16se="http://schemas.microsoft.com/office/word/2015/wordml/symex" xmlns:wpg="http://schemas.microsoft.com/office/word/2010/wordprocessingGroup" xmlns:wpi="http://schemas.microsoft.com/office/word/2010/wordprocessingInk" xmlns:wne="http://schemas.microsoft.com/office/word/2006/wordml" xmlns:wps="http://schemas.microsoft.com/office/word/2010/wordprocessingShape" mc:Ignorable="w14 w15 w16se w16cid w16 w16cex w16sdtdh w16sdtfl w16du wp14">
   <w:abstractNum w:abstractNumId="0" w15:restartNumberingAfterBreak="0">
-    <w:nsid w:val="08DE6987"/>
+    <w:nsid w:val="428936B2"/>
     <w:multiLevelType w:val="hybridMultilevel"/>
-    <w:tmpl w:val="492CA982"/>
-    <w:lvl w:ilvl="0" w:tplc="77DEEC18">
-      <w:start w:val="1"/>
-      <w:numFmt w:val="bullet"/>
-      <w:lvlText w:val="●"/>
-      <w:lvlJc w:val="left"/>
-      <w:pPr>
-        <w:ind w:left="720" w:hanging="360"/>
-      </w:pPr>
-    </w:lvl>
-    <w:lvl w:ilvl="1" w:tplc="E7EE3E3E">
-      <w:start w:val="1"/>
-      <w:numFmt w:val="bullet"/>
-      <w:lvlText w:val="○"/>
-      <w:lvlJc w:val="left"/>
-      <w:pPr>
-        <w:ind w:left="1440" w:hanging="360"/>
-      </w:pPr>
-    </w:lvl>
-    <w:lvl w:ilvl="2" w:tplc="197C30FA">
-      <w:start w:val="1"/>
-      <w:numFmt w:val="bullet"/>
-      <w:lvlText w:val="■"/>
-      <w:lvlJc w:val="left"/>
-      <w:pPr>
-        <w:ind w:left="2160" w:hanging="360"/>
-      </w:pPr>
-    </w:lvl>
-    <w:lvl w:ilvl="3" w:tplc="42A882D4">
-      <w:start w:val="1"/>
-      <w:numFmt w:val="bullet"/>
-      <w:lvlText w:val="●"/>
-      <w:lvlJc w:val="left"/>
-      <w:pPr>
-        <w:ind w:left="2880" w:hanging="360"/>
-      </w:pPr>
-    </w:lvl>
-    <w:lvl w:ilvl="4" w:tplc="91BEBA3C">
-      <w:start w:val="1"/>
-      <w:numFmt w:val="bullet"/>
-      <w:lvlText w:val="○"/>
-      <w:lvlJc w:val="left"/>
-      <w:pPr>
-        <w:ind w:left="3600" w:hanging="360"/>
-      </w:pPr>
-    </w:lvl>
-    <w:lvl w:ilvl="5" w:tplc="06C03862">
-      <w:start w:val="1"/>
-      <w:numFmt w:val="bullet"/>
-      <w:lvlText w:val="■"/>
-      <w:lvlJc w:val="left"/>
-      <w:pPr>
-        <w:ind w:left="4320" w:hanging="360"/>
-      </w:pPr>
-    </w:lvl>
-    <w:lvl w:ilvl="6" w:tplc="54A0F708">
-      <w:start w:val="1"/>
-      <w:numFmt w:val="bullet"/>
-      <w:lvlText w:val="●"/>
-      <w:lvlJc w:val="left"/>
-      <w:pPr>
-        <w:ind w:left="5040" w:hanging="360"/>
-      </w:pPr>
-    </w:lvl>
-    <w:lvl w:ilvl="7" w:tplc="86F289EA">
-      <w:start w:val="1"/>
-      <w:numFmt w:val="bullet"/>
-      <w:lvlText w:val="●"/>
-      <w:lvlJc w:val="left"/>
-      <w:pPr>
-        <w:ind w:left="5760" w:hanging="360"/>
-      </w:pPr>
-    </w:lvl>
-    <w:lvl w:ilvl="8" w:tplc="77FA46F8">
-      <w:start w:val="1"/>
-      <w:numFmt w:val="bullet"/>
-      <w:lvlText w:val="●"/>
-      <w:lvlJc w:val="left"/>
-      <w:pPr>
-        <w:ind w:left="6480" w:hanging="360"/>
-      </w:pPr>
-    </w:lvl>
-  </w:abstractNum>
-  <w:abstractNum w:abstractNumId="1" w15:restartNumberingAfterBreak="0">
-    <w:nsid w:val="74D56D8D"/>
-    <w:multiLevelType w:val="hybridMultilevel"/>
-    <w:tmpl w:val="248C857C"/>
-    <w:lvl w:ilvl="0" w:tplc="7D7A41CC">
+    <w:tmpl w:val="F2065CB6"/>
+    <w:lvl w:ilvl="0" w:tplc="21E24B14">
       <w:start w:val="1"/>
       <w:numFmt w:val="bullet"/>
       <w:lvlText w:val="–"/>
@@ -7159,55 +5521,141 @@
         <w:ind w:left="720" w:hanging="360"/>
       </w:pPr>
     </w:lvl>
-    <w:lvl w:ilvl="1" w:tplc="8BF6D99A">
+    <w:lvl w:ilvl="1" w:tplc="C044A218">
       <w:numFmt w:val="decimal"/>
       <w:lvlText w:val=""/>
       <w:lvlJc w:val="left"/>
     </w:lvl>
-    <w:lvl w:ilvl="2" w:tplc="7B2CAB58">
+    <w:lvl w:ilvl="2" w:tplc="E5CC40DE">
       <w:numFmt w:val="decimal"/>
       <w:lvlText w:val=""/>
       <w:lvlJc w:val="left"/>
     </w:lvl>
-    <w:lvl w:ilvl="3" w:tplc="F8F0AFC4">
+    <w:lvl w:ilvl="3" w:tplc="D62AB5A8">
       <w:numFmt w:val="decimal"/>
       <w:lvlText w:val=""/>
       <w:lvlJc w:val="left"/>
     </w:lvl>
-    <w:lvl w:ilvl="4" w:tplc="A3823526">
+    <w:lvl w:ilvl="4" w:tplc="6BCAAF3C">
       <w:numFmt w:val="decimal"/>
       <w:lvlText w:val=""/>
       <w:lvlJc w:val="left"/>
     </w:lvl>
-    <w:lvl w:ilvl="5" w:tplc="8416ADB0">
+    <w:lvl w:ilvl="5" w:tplc="1D606A7E">
       <w:numFmt w:val="decimal"/>
       <w:lvlText w:val=""/>
       <w:lvlJc w:val="left"/>
     </w:lvl>
-    <w:lvl w:ilvl="6" w:tplc="D08869A2">
+    <w:lvl w:ilvl="6" w:tplc="E1F0317E">
       <w:numFmt w:val="decimal"/>
       <w:lvlText w:val=""/>
       <w:lvlJc w:val="left"/>
     </w:lvl>
-    <w:lvl w:ilvl="7" w:tplc="FC747ABE">
+    <w:lvl w:ilvl="7" w:tplc="3F6A59F4">
       <w:numFmt w:val="decimal"/>
       <w:lvlText w:val=""/>
       <w:lvlJc w:val="left"/>
     </w:lvl>
-    <w:lvl w:ilvl="8" w:tplc="600AB314">
+    <w:lvl w:ilvl="8" w:tplc="3CCA8A9A">
       <w:numFmt w:val="decimal"/>
       <w:lvlText w:val=""/>
       <w:lvlJc w:val="left"/>
     </w:lvl>
   </w:abstractNum>
-  <w:num w:numId="1" w16cid:durableId="1995067863">
-    <w:abstractNumId w:val="0"/>
+  <w:abstractNum w:abstractNumId="1" w15:restartNumberingAfterBreak="0">
+    <w:nsid w:val="56FD610B"/>
+    <w:multiLevelType w:val="hybridMultilevel"/>
+    <w:tmpl w:val="4D4CF438"/>
+    <w:lvl w:ilvl="0" w:tplc="D20A612A">
+      <w:start w:val="1"/>
+      <w:numFmt w:val="bullet"/>
+      <w:lvlText w:val="●"/>
+      <w:lvlJc w:val="left"/>
+      <w:pPr>
+        <w:ind w:left="720" w:hanging="360"/>
+      </w:pPr>
+    </w:lvl>
+    <w:lvl w:ilvl="1" w:tplc="17F44504">
+      <w:start w:val="1"/>
+      <w:numFmt w:val="bullet"/>
+      <w:lvlText w:val="○"/>
+      <w:lvlJc w:val="left"/>
+      <w:pPr>
+        <w:ind w:left="1440" w:hanging="360"/>
+      </w:pPr>
+    </w:lvl>
+    <w:lvl w:ilvl="2" w:tplc="0562D692">
+      <w:start w:val="1"/>
+      <w:numFmt w:val="bullet"/>
+      <w:lvlText w:val="■"/>
+      <w:lvlJc w:val="left"/>
+      <w:pPr>
+        <w:ind w:left="2160" w:hanging="360"/>
+      </w:pPr>
+    </w:lvl>
+    <w:lvl w:ilvl="3" w:tplc="55F28B60">
+      <w:start w:val="1"/>
+      <w:numFmt w:val="bullet"/>
+      <w:lvlText w:val="●"/>
+      <w:lvlJc w:val="left"/>
+      <w:pPr>
+        <w:ind w:left="2880" w:hanging="360"/>
+      </w:pPr>
+    </w:lvl>
+    <w:lvl w:ilvl="4" w:tplc="650E3742">
+      <w:start w:val="1"/>
+      <w:numFmt w:val="bullet"/>
+      <w:lvlText w:val="○"/>
+      <w:lvlJc w:val="left"/>
+      <w:pPr>
+        <w:ind w:left="3600" w:hanging="360"/>
+      </w:pPr>
+    </w:lvl>
+    <w:lvl w:ilvl="5" w:tplc="67DE1C2E">
+      <w:start w:val="1"/>
+      <w:numFmt w:val="bullet"/>
+      <w:lvlText w:val="■"/>
+      <w:lvlJc w:val="left"/>
+      <w:pPr>
+        <w:ind w:left="4320" w:hanging="360"/>
+      </w:pPr>
+    </w:lvl>
+    <w:lvl w:ilvl="6" w:tplc="51A218C0">
+      <w:start w:val="1"/>
+      <w:numFmt w:val="bullet"/>
+      <w:lvlText w:val="●"/>
+      <w:lvlJc w:val="left"/>
+      <w:pPr>
+        <w:ind w:left="5040" w:hanging="360"/>
+      </w:pPr>
+    </w:lvl>
+    <w:lvl w:ilvl="7" w:tplc="FB50C560">
+      <w:start w:val="1"/>
+      <w:numFmt w:val="bullet"/>
+      <w:lvlText w:val="●"/>
+      <w:lvlJc w:val="left"/>
+      <w:pPr>
+        <w:ind w:left="5760" w:hanging="360"/>
+      </w:pPr>
+    </w:lvl>
+    <w:lvl w:ilvl="8" w:tplc="8FC4BAD8">
+      <w:start w:val="1"/>
+      <w:numFmt w:val="bullet"/>
+      <w:lvlText w:val="●"/>
+      <w:lvlJc w:val="left"/>
+      <w:pPr>
+        <w:ind w:left="6480" w:hanging="360"/>
+      </w:pPr>
+    </w:lvl>
+  </w:abstractNum>
+  <w:num w:numId="1" w16cid:durableId="678309356">
+    <w:abstractNumId w:val="1"/>
     <w:lvlOverride w:ilvl="0">
       <w:startOverride w:val="1"/>
     </w:lvlOverride>
   </w:num>
-  <w:num w:numId="2" w16cid:durableId="127551965">
-    <w:abstractNumId w:val="1"/>
+  <w:num w:numId="2" w16cid:durableId="326439242">
+    <w:abstractNumId w:val="0"/>
     <w:lvlOverride w:ilvl="0">
       <w:startOverride w:val="1"/>
     </w:lvlOverride>
@@ -7704,7 +6152,6 @@
   <w:style w:type="character" w:default="1" w:styleId="a0">
     <w:name w:val="Default Paragraph Font"/>
     <w:uiPriority w:val="1"/>
-    <w:semiHidden/>
     <w:unhideWhenUsed/>
   </w:style>
   <w:style w:type="table" w:default="1" w:styleId="a1">
@@ -7820,30 +6267,58 @@
       <w:szCs w:val="20"/>
     </w:rPr>
   </w:style>
-  <w:style w:type="paragraph" w:styleId="11">
-    <w:name w:val="toc 1"/>
+  <w:style w:type="character" w:styleId="ac">
+    <w:name w:val="Strong"/>
+    <w:basedOn w:val="a0"/>
+    <w:uiPriority w:val="22"/>
+    <w:qFormat/>
+    <w:rsid w:val="00AD3641"/>
+    <w:rPr>
+      <w:b/>
+      <w:bCs/>
+    </w:rPr>
+  </w:style>
+  <w:style w:type="paragraph" w:styleId="ad">
+    <w:name w:val="header"/>
     <w:basedOn w:val="a"/>
-    <w:next w:val="a"/>
-    <w:autoRedefine/>
-    <w:uiPriority w:val="39"/>
+    <w:link w:val="ae"/>
+    <w:uiPriority w:val="99"/>
     <w:unhideWhenUsed/>
-    <w:rsid w:val="009316B9"/>
+    <w:rsid w:val="00D56452"/>
     <w:pPr>
-      <w:spacing w:after="100"/>
+      <w:tabs>
+        <w:tab w:val="center" w:pos="4677"/>
+        <w:tab w:val="right" w:pos="9355"/>
+      </w:tabs>
     </w:pPr>
   </w:style>
-  <w:style w:type="paragraph" w:styleId="20">
-    <w:name w:val="toc 2"/>
+  <w:style w:type="character" w:customStyle="1" w:styleId="ae">
+    <w:name w:val="Верхний колонтитул Знак"/>
+    <w:basedOn w:val="a0"/>
+    <w:link w:val="ad"/>
+    <w:uiPriority w:val="99"/>
+    <w:rsid w:val="00D56452"/>
+  </w:style>
+  <w:style w:type="paragraph" w:styleId="af">
+    <w:name w:val="footer"/>
     <w:basedOn w:val="a"/>
-    <w:next w:val="a"/>
-    <w:autoRedefine/>
-    <w:uiPriority w:val="39"/>
+    <w:link w:val="af0"/>
+    <w:uiPriority w:val="99"/>
     <w:unhideWhenUsed/>
-    <w:rsid w:val="009316B9"/>
+    <w:rsid w:val="00D56452"/>
     <w:pPr>
-      <w:spacing w:after="100"/>
-      <w:ind w:left="240"/>
+      <w:tabs>
+        <w:tab w:val="center" w:pos="4677"/>
+        <w:tab w:val="right" w:pos="9355"/>
+      </w:tabs>
     </w:pPr>
+  </w:style>
+  <w:style w:type="character" w:customStyle="1" w:styleId="af0">
+    <w:name w:val="Нижний колонтитул Знак"/>
+    <w:basedOn w:val="a0"/>
+    <w:link w:val="af"/>
+    <w:uiPriority w:val="99"/>
+    <w:rsid w:val="00D56452"/>
   </w:style>
 </w:styles>
 </file>

</xml_diff>